<commit_message>
till chat model, chat client,
</commit_message>
<xml_diff>
--- a/docs (springboot)/module6.docx
+++ b/docs (springboot)/module6.docx
@@ -718,6 +718,145 @@
     </w:p>
     <w:p>
       <w:pPr>
+        <w:rPr>
+          <w:rFonts w:hint="default" w:ascii="Bodoni MT" w:hAnsi="Bodoni MT" w:cs="Bodoni MT"/>
+        </w:rPr>
+      </w:pPr>
+      <w:r>
+        <w:rPr>
+          <w:rFonts w:hint="default" w:ascii="Bodoni MT" w:hAnsi="Bodoni MT" w:cs="Bodoni MT"/>
+          <w:b w:val="0"/>
+          <w:bCs w:val="0"/>
+          <w:lang w:val="en-IN"/>
+        </w:rPr>
+        <w:br w:type="page"/>
+      </w:r>
+    </w:p>
+    <w:p>
+      <w:pPr>
+        <w:keepNext w:val="0"/>
+        <w:keepLines w:val="0"/>
+        <w:widowControl/>
+        <w:numPr>
+          <w:ilvl w:val="0"/>
+          <w:numId w:val="11"/>
+        </w:numPr>
+        <w:suppressLineNumbers w:val="0"/>
+        <w:spacing w:before="0" w:beforeAutospacing="0" w:after="0" w:afterAutospacing="0" w:line="360" w:lineRule="auto"/>
+        <w:ind w:left="420" w:leftChars="0" w:right="0" w:hanging="420" w:firstLineChars="0"/>
+        <w:jc w:val="left"/>
+        <w:rPr>
+          <w:rFonts w:hint="default" w:ascii="Bodoni MT" w:hAnsi="Bodoni MT" w:cs="Bodoni MT"/>
+          <w:b/>
+          <w:bCs/>
+          <w:color w:val="002060"/>
+          <w:sz w:val="30"/>
+          <w:szCs w:val="30"/>
+          <w:highlight w:val="lightGray"/>
+          <w:u w:val="single"/>
+        </w:rPr>
+      </w:pPr>
+      <w:r>
+        <w:rPr>
+          <w:rFonts w:hint="default" w:ascii="Bodoni MT" w:hAnsi="Bodoni MT" w:cs="Bodoni MT"/>
+          <w:b/>
+          <w:bCs/>
+          <w:color w:val="002060"/>
+          <w:sz w:val="30"/>
+          <w:szCs w:val="30"/>
+          <w:highlight w:val="lightGray"/>
+          <w:u w:val="single"/>
+          <w:lang w:val="en-IN"/>
+        </w:rPr>
+        <w:t xml:space="preserve">Frontend &amp; Backend in Google OAUTH2    (in general)     </w:t>
+      </w:r>
+    </w:p>
+    <w:p>
+      <w:pPr>
+        <w:keepNext w:val="0"/>
+        <w:keepLines w:val="0"/>
+        <w:widowControl/>
+        <w:numPr>
+          <w:ilvl w:val="0"/>
+          <w:numId w:val="11"/>
+        </w:numPr>
+        <w:suppressLineNumbers w:val="0"/>
+        <w:spacing w:before="0" w:beforeAutospacing="0" w:after="0" w:afterAutospacing="0" w:line="360" w:lineRule="auto"/>
+        <w:ind w:left="420" w:leftChars="0" w:right="0" w:hanging="420" w:firstLineChars="0"/>
+        <w:jc w:val="left"/>
+        <w:rPr>
+          <w:rFonts w:hint="default" w:ascii="Bodoni MT" w:hAnsi="Bodoni MT" w:cs="Bodoni MT"/>
+          <w:color w:val="auto"/>
+          <w:highlight w:val="none"/>
+        </w:rPr>
+      </w:pPr>
+      <w:r>
+        <w:rPr>
+          <w:rFonts w:hint="default" w:ascii="Bodoni MT" w:hAnsi="Bodoni MT" w:cs="Bodoni MT"/>
+          <w:color w:val="auto"/>
+          <w:highlight w:val="none"/>
+          <w:lang w:val="en-IN"/>
+        </w:rPr>
+        <w:t xml:space="preserve">In case of </w:t>
+      </w:r>
+      <w:r>
+        <w:rPr>
+          <w:rFonts w:hint="default" w:ascii="Bodoni MT" w:hAnsi="Bodoni MT" w:cs="Bodoni MT"/>
+          <w:b/>
+          <w:bCs/>
+          <w:color w:val="auto"/>
+          <w:highlight w:val="none"/>
+          <w:lang w:val="en-IN"/>
+        </w:rPr>
+        <w:t xml:space="preserve">“sign in with google”, </w:t>
+      </w:r>
+      <w:r>
+        <w:rPr>
+          <w:rFonts w:hint="default" w:ascii="Bodoni MT" w:hAnsi="Bodoni MT" w:cs="Bodoni MT"/>
+          <w:b w:val="0"/>
+          <w:bCs w:val="0"/>
+          <w:color w:val="auto"/>
+          <w:highlight w:val="none"/>
+          <w:lang w:val="en-IN"/>
+        </w:rPr>
+        <w:t xml:space="preserve">There are </w:t>
+      </w:r>
+      <w:r>
+        <w:rPr>
+          <w:rFonts w:hint="default" w:ascii="Bodoni MT" w:hAnsi="Bodoni MT" w:cs="Bodoni MT"/>
+          <w:b/>
+          <w:bCs/>
+          <w:color w:val="7030A0"/>
+          <w:highlight w:val="none"/>
+          <w:lang w:val="en-IN"/>
+        </w:rPr>
+        <w:t xml:space="preserve">2 </w:t>
+      </w:r>
+      <w:r>
+        <w:rPr>
+          <w:rFonts w:hint="default" w:ascii="Bodoni MT" w:hAnsi="Bodoni MT" w:cs="Bodoni MT"/>
+          <w:b w:val="0"/>
+          <w:bCs w:val="0"/>
+          <w:color w:val="7030A0"/>
+          <w:highlight w:val="none"/>
+          <w:lang w:val="en-IN"/>
+        </w:rPr>
+        <w:t>backends</w:t>
+      </w:r>
+      <w:r>
+        <w:rPr>
+          <w:rFonts w:hint="default" w:ascii="Bodoni MT" w:hAnsi="Bodoni MT" w:cs="Bodoni MT"/>
+          <w:b w:val="0"/>
+          <w:bCs w:val="0"/>
+          <w:color w:val="auto"/>
+          <w:highlight w:val="none"/>
+          <w:lang w:val="en-IN"/>
+        </w:rPr>
+        <w:t xml:space="preserve"> involved</w:t>
+      </w:r>
+    </w:p>
+    <w:p>
+      <w:pPr>
         <w:keepNext w:val="0"/>
         <w:keepLines w:val="0"/>
         <w:widowControl/>
@@ -731,23 +870,47 @@
         <w:jc w:val="left"/>
         <w:rPr>
           <w:rFonts w:hint="default" w:ascii="Bodoni MT" w:hAnsi="Bodoni MT" w:cs="Bodoni MT"/>
-        </w:rPr>
-      </w:pPr>
-    </w:p>
-    <w:p>
-      <w:pPr>
-        <w:rPr>
-          <w:rFonts w:hint="default" w:ascii="Bodoni MT" w:hAnsi="Bodoni MT" w:cs="Bodoni MT"/>
-        </w:rPr>
-      </w:pPr>
-      <w:r>
-        <w:rPr>
-          <w:rFonts w:hint="default" w:ascii="Bodoni MT" w:hAnsi="Bodoni MT" w:cs="Bodoni MT"/>
-          <w:b w:val="0"/>
-          <w:bCs w:val="0"/>
-          <w:lang w:val="en-IN"/>
-        </w:rPr>
-        <w:br w:type="page"/>
+          <w:color w:val="auto"/>
+          <w:highlight w:val="none"/>
+        </w:rPr>
+      </w:pPr>
+      <w:r>
+        <w:rPr>
+          <w:rFonts w:hint="default" w:ascii="Bodoni MT" w:hAnsi="Bodoni MT" w:cs="Bodoni MT"/>
+          <w:color w:val="auto"/>
+          <w:highlight w:val="none"/>
+          <w:lang w:val="en-IN"/>
+        </w:rPr>
+        <w:t>Our own backend</w:t>
+      </w:r>
+    </w:p>
+    <w:p>
+      <w:pPr>
+        <w:keepNext w:val="0"/>
+        <w:keepLines w:val="0"/>
+        <w:widowControl/>
+        <w:numPr>
+          <w:ilvl w:val="1"/>
+          <w:numId w:val="11"/>
+        </w:numPr>
+        <w:suppressLineNumbers w:val="0"/>
+        <w:spacing w:before="0" w:beforeAutospacing="0" w:after="0" w:afterAutospacing="0" w:line="360" w:lineRule="auto"/>
+        <w:ind w:left="840" w:leftChars="0" w:right="0" w:hanging="420" w:firstLineChars="0"/>
+        <w:jc w:val="left"/>
+        <w:rPr>
+          <w:rFonts w:hint="default" w:ascii="Bodoni MT" w:hAnsi="Bodoni MT" w:cs="Bodoni MT"/>
+          <w:color w:val="auto"/>
+          <w:highlight w:val="none"/>
+        </w:rPr>
+      </w:pPr>
+      <w:r>
+        <w:rPr>
+          <w:rFonts w:hint="default" w:ascii="Bodoni MT" w:hAnsi="Bodoni MT" w:cs="Bodoni MT"/>
+          <w:color w:val="auto"/>
+          <w:highlight w:val="none"/>
+          <w:lang w:val="en-IN"/>
+        </w:rPr>
+        <w:t>Google’s backend</w:t>
       </w:r>
     </w:p>
     <w:p>
@@ -765,112 +928,44 @@
         <w:jc w:val="left"/>
         <w:rPr>
           <w:rFonts w:hint="default" w:ascii="Bodoni MT" w:hAnsi="Bodoni MT" w:cs="Bodoni MT"/>
+          <w:color w:val="auto"/>
+          <w:highlight w:val="none"/>
+        </w:rPr>
+      </w:pPr>
+      <w:r>
+        <w:rPr>
+          <w:rFonts w:hint="default" w:ascii="Bodoni MT" w:hAnsi="Bodoni MT" w:cs="Bodoni MT"/>
+          <w:color w:val="auto"/>
+          <w:highlight w:val="none"/>
+          <w:lang w:val="en-IN"/>
+        </w:rPr>
+        <w:t xml:space="preserve">After clicking on that “sign in with google” button, the </w:t>
+      </w:r>
+      <w:r>
+        <w:rPr>
+          <w:rFonts w:hint="default" w:ascii="Bodoni MT" w:hAnsi="Bodoni MT" w:cs="Bodoni MT"/>
           <w:b/>
           <w:bCs/>
-          <w:color w:val="002060"/>
-          <w:sz w:val="30"/>
-          <w:szCs w:val="30"/>
-          <w:highlight w:val="lightGray"/>
-          <w:u w:val="single"/>
-        </w:rPr>
-      </w:pPr>
-      <w:r>
-        <w:rPr>
-          <w:rFonts w:hint="default" w:ascii="Bodoni MT" w:hAnsi="Bodoni MT" w:cs="Bodoni MT"/>
-          <w:b/>
-          <w:bCs/>
-          <w:color w:val="002060"/>
-          <w:sz w:val="30"/>
-          <w:szCs w:val="30"/>
-          <w:highlight w:val="lightGray"/>
-          <w:u w:val="single"/>
-          <w:lang w:val="en-IN"/>
-        </w:rPr>
-        <w:t xml:space="preserve">Frontend &amp; Backend in Google OAUTH2    (in general)     </w:t>
-      </w:r>
-    </w:p>
-    <w:p>
-      <w:pPr>
-        <w:keepNext w:val="0"/>
-        <w:keepLines w:val="0"/>
-        <w:widowControl/>
-        <w:numPr>
-          <w:ilvl w:val="0"/>
-          <w:numId w:val="11"/>
-        </w:numPr>
-        <w:suppressLineNumbers w:val="0"/>
-        <w:spacing w:before="0" w:beforeAutospacing="0" w:after="0" w:afterAutospacing="0" w:line="360" w:lineRule="auto"/>
-        <w:ind w:left="420" w:leftChars="0" w:right="0" w:hanging="420" w:firstLineChars="0"/>
-        <w:jc w:val="left"/>
-        <w:rPr>
-          <w:rFonts w:hint="default" w:ascii="Bodoni MT" w:hAnsi="Bodoni MT" w:cs="Bodoni MT"/>
+          <w:i/>
+          <w:iCs/>
           <w:color w:val="auto"/>
           <w:highlight w:val="none"/>
-        </w:rPr>
-      </w:pPr>
-      <w:r>
-        <w:rPr>
-          <w:rFonts w:hint="default" w:ascii="Bodoni MT" w:hAnsi="Bodoni MT" w:cs="Bodoni MT"/>
+          <w:lang w:val="en-IN"/>
+        </w:rPr>
+        <w:t>frontend</w:t>
+      </w:r>
+      <w:r>
+        <w:rPr>
+          <w:rFonts w:hint="default" w:ascii="Bodoni MT" w:hAnsi="Bodoni MT" w:cs="Bodoni MT"/>
+          <w:b w:val="0"/>
+          <w:bCs w:val="0"/>
+          <w:i w:val="0"/>
+          <w:iCs w:val="0"/>
           <w:color w:val="auto"/>
           <w:highlight w:val="none"/>
           <w:lang w:val="en-IN"/>
         </w:rPr>
-        <w:t xml:space="preserve">In case of </w:t>
-      </w:r>
-      <w:r>
-        <w:rPr>
-          <w:rFonts w:hint="default" w:ascii="Bodoni MT" w:hAnsi="Bodoni MT" w:cs="Bodoni MT"/>
-          <w:b/>
-          <w:bCs/>
-          <w:color w:val="auto"/>
-          <w:highlight w:val="none"/>
-          <w:lang w:val="en-IN"/>
-        </w:rPr>
-        <w:t xml:space="preserve">“sign in with google”, </w:t>
-      </w:r>
-      <w:r>
-        <w:rPr>
-          <w:rFonts w:hint="default" w:ascii="Bodoni MT" w:hAnsi="Bodoni MT" w:cs="Bodoni MT"/>
-          <w:b w:val="0"/>
-          <w:bCs w:val="0"/>
-          <w:color w:val="auto"/>
-          <w:highlight w:val="none"/>
-          <w:lang w:val="en-IN"/>
-        </w:rPr>
-        <w:t xml:space="preserve">There are </w:t>
-      </w:r>
-      <w:r>
-        <w:rPr>
-          <w:rFonts w:hint="default" w:ascii="Bodoni MT" w:hAnsi="Bodoni MT" w:cs="Bodoni MT"/>
-          <w:b/>
-          <w:bCs/>
-          <w:color w:val="7030A0"/>
-          <w:highlight w:val="none"/>
-          <w:lang w:val="en-IN"/>
-        </w:rPr>
-        <w:t xml:space="preserve">2 </w:t>
-      </w:r>
-      <w:r>
-        <w:rPr>
-          <w:rFonts w:hint="default" w:ascii="Bodoni MT" w:hAnsi="Bodoni MT" w:cs="Bodoni MT"/>
-          <w:b w:val="0"/>
-          <w:bCs w:val="0"/>
-          <w:color w:val="7030A0"/>
-          <w:highlight w:val="none"/>
-          <w:lang w:val="en-IN"/>
-        </w:rPr>
-        <w:t>backends</w:t>
-      </w:r>
-      <w:r>
-        <w:rPr>
-          <w:rFonts w:hint="default" w:ascii="Bodoni MT" w:hAnsi="Bodoni MT" w:cs="Bodoni MT"/>
-          <w:b w:val="0"/>
-          <w:bCs w:val="0"/>
-          <w:color w:val="auto"/>
-          <w:highlight w:val="none"/>
-          <w:lang w:val="en-IN"/>
-        </w:rPr>
-        <w:t xml:space="preserve"> involved</w:t>
+        <w:t xml:space="preserve"> triggers one request which is:</w:t>
       </w:r>
     </w:p>
     <w:p>
@@ -895,11 +990,68 @@
       <w:r>
         <w:rPr>
           <w:rFonts w:hint="default" w:ascii="Bodoni MT" w:hAnsi="Bodoni MT" w:cs="Bodoni MT"/>
+          <w:b/>
+          <w:bCs/>
+          <w:i w:val="0"/>
+          <w:iCs w:val="0"/>
+          <w:color w:val="0070C0"/>
+          <w:highlight w:val="none"/>
+          <w:lang w:val="en-IN"/>
+        </w:rPr>
+        <w:t>GET /oauth2/authorization/google</w:t>
+      </w:r>
+      <w:r>
+        <w:rPr>
+          <w:rFonts w:hint="default" w:ascii="Bodoni MT" w:hAnsi="Bodoni MT" w:cs="Bodoni MT"/>
+          <w:b w:val="0"/>
+          <w:bCs w:val="0"/>
+          <w:i w:val="0"/>
+          <w:iCs w:val="0"/>
+          <w:color w:val="C00000"/>
+          <w:highlight w:val="none"/>
+          <w:lang w:val="en-IN"/>
+        </w:rPr>
+        <w:t xml:space="preserve"> </w:t>
+      </w:r>
+      <w:r>
+        <w:rPr>
+          <w:rFonts w:hint="default" w:ascii="Bodoni MT" w:hAnsi="Bodoni MT" w:cs="Bodoni MT"/>
+          <w:b w:val="0"/>
+          <w:bCs w:val="0"/>
+          <w:i w:val="0"/>
+          <w:iCs w:val="0"/>
           <w:color w:val="auto"/>
           <w:highlight w:val="none"/>
           <w:lang w:val="en-IN"/>
         </w:rPr>
-        <w:t>Our own backend</w:t>
+        <w:t xml:space="preserve">  (this is our </w:t>
+      </w:r>
+      <w:r>
+        <w:rPr>
+          <w:rFonts w:hint="default" w:ascii="Bodoni MT" w:hAnsi="Bodoni MT" w:cs="Bodoni MT"/>
+          <w:b w:val="0"/>
+          <w:bCs w:val="0"/>
+          <w:i w:val="0"/>
+          <w:iCs w:val="0"/>
+          <w:color w:val="auto"/>
+          <w:highlight w:val="none"/>
+          <w:shd w:val="clear" w:color="FFFFFF" w:fill="D9D9D9"/>
+          <w:lang w:val="en-IN"/>
+        </w:rPr>
+        <w:t>backend’s path</w:t>
+      </w:r>
+      <w:r>
+        <w:rPr>
+          <w:rFonts w:hint="default" w:ascii="Bodoni MT" w:hAnsi="Bodoni MT" w:cs="Bodoni MT"/>
+          <w:b w:val="0"/>
+          <w:bCs w:val="0"/>
+          <w:i w:val="0"/>
+          <w:iCs w:val="0"/>
+          <w:color w:val="auto"/>
+          <w:highlight w:val="none"/>
+          <w:lang w:val="en-IN"/>
+        </w:rPr>
+        <w:t>; not google’s)</w:t>
       </w:r>
     </w:p>
     <w:p>
@@ -924,57 +1076,6 @@
       <w:r>
         <w:rPr>
           <w:rFonts w:hint="default" w:ascii="Bodoni MT" w:hAnsi="Bodoni MT" w:cs="Bodoni MT"/>
-          <w:color w:val="auto"/>
-          <w:highlight w:val="none"/>
-          <w:lang w:val="en-IN"/>
-        </w:rPr>
-        <w:t>Google’s backend</w:t>
-      </w:r>
-    </w:p>
-    <w:p>
-      <w:pPr>
-        <w:keepNext w:val="0"/>
-        <w:keepLines w:val="0"/>
-        <w:widowControl/>
-        <w:numPr>
-          <w:ilvl w:val="0"/>
-          <w:numId w:val="11"/>
-        </w:numPr>
-        <w:suppressLineNumbers w:val="0"/>
-        <w:spacing w:before="0" w:beforeAutospacing="0" w:after="0" w:afterAutospacing="0" w:line="360" w:lineRule="auto"/>
-        <w:ind w:left="420" w:leftChars="0" w:right="0" w:hanging="420" w:firstLineChars="0"/>
-        <w:jc w:val="left"/>
-        <w:rPr>
-          <w:rFonts w:hint="default" w:ascii="Bodoni MT" w:hAnsi="Bodoni MT" w:cs="Bodoni MT"/>
-          <w:color w:val="auto"/>
-          <w:highlight w:val="none"/>
-        </w:rPr>
-      </w:pPr>
-      <w:r>
-        <w:rPr>
-          <w:rFonts w:hint="default" w:ascii="Bodoni MT" w:hAnsi="Bodoni MT" w:cs="Bodoni MT"/>
-          <w:color w:val="auto"/>
-          <w:highlight w:val="none"/>
-          <w:lang w:val="en-IN"/>
-        </w:rPr>
-        <w:t xml:space="preserve">After clicking on that “sign in with google” button, the </w:t>
-      </w:r>
-      <w:r>
-        <w:rPr>
-          <w:rFonts w:hint="default" w:ascii="Bodoni MT" w:hAnsi="Bodoni MT" w:cs="Bodoni MT"/>
-          <w:b/>
-          <w:bCs/>
-          <w:i/>
-          <w:iCs/>
-          <w:color w:val="auto"/>
-          <w:highlight w:val="none"/>
-          <w:lang w:val="en-IN"/>
-        </w:rPr>
-        <w:t>frontend</w:t>
-      </w:r>
-      <w:r>
-        <w:rPr>
-          <w:rFonts w:hint="default" w:ascii="Bodoni MT" w:hAnsi="Bodoni MT" w:cs="Bodoni MT"/>
           <w:b w:val="0"/>
           <w:bCs w:val="0"/>
           <w:i w:val="0"/>
@@ -983,7 +1084,59 @@
           <w:highlight w:val="none"/>
           <w:lang w:val="en-IN"/>
         </w:rPr>
-        <w:t xml:space="preserve"> triggers one request which is:</w:t>
+        <w:t xml:space="preserve">We don’t write this end point by our self; this is </w:t>
+      </w:r>
+      <w:r>
+        <w:rPr>
+          <w:rFonts w:hint="default" w:ascii="Bodoni MT" w:hAnsi="Bodoni MT" w:cs="Bodoni MT"/>
+          <w:b/>
+          <w:bCs/>
+          <w:i w:val="0"/>
+          <w:iCs w:val="0"/>
+          <w:color w:val="auto"/>
+          <w:highlight w:val="none"/>
+          <w:lang w:val="en-IN"/>
+        </w:rPr>
+        <w:t>auto-created</w:t>
+      </w:r>
+      <w:r>
+        <w:rPr>
+          <w:rFonts w:hint="default" w:ascii="Bodoni MT" w:hAnsi="Bodoni MT" w:cs="Bodoni MT"/>
+          <w:b w:val="0"/>
+          <w:bCs w:val="0"/>
+          <w:i w:val="0"/>
+          <w:iCs w:val="0"/>
+          <w:color w:val="auto"/>
+          <w:highlight w:val="none"/>
+          <w:lang w:val="en-IN"/>
+        </w:rPr>
+        <w:t xml:space="preserve"> by </w:t>
+      </w:r>
+      <w:r>
+        <w:rPr>
+          <w:rFonts w:hint="default" w:ascii="Bodoni MT" w:hAnsi="Bodoni MT" w:cs="Bodoni MT"/>
+          <w:b w:val="0"/>
+          <w:bCs w:val="0"/>
+          <w:i w:val="0"/>
+          <w:iCs w:val="0"/>
+          <w:color w:val="7030A0"/>
+          <w:highlight w:val="none"/>
+          <w:lang w:val="en-IN"/>
+        </w:rPr>
+        <w:t>Spring Security OAuth2 Client</w:t>
+      </w:r>
+      <w:r>
+        <w:rPr>
+          <w:rFonts w:hint="default" w:ascii="Bodoni MT" w:hAnsi="Bodoni MT" w:cs="Bodoni MT"/>
+          <w:b w:val="0"/>
+          <w:bCs w:val="0"/>
+          <w:i w:val="0"/>
+          <w:iCs w:val="0"/>
+          <w:color w:val="auto"/>
+          <w:highlight w:val="none"/>
+          <w:lang w:val="en-IN"/>
+        </w:rPr>
+        <w:t>.</w:t>
       </w:r>
     </w:p>
     <w:p>
@@ -1008,160 +1161,29 @@
       <w:r>
         <w:rPr>
           <w:rFonts w:hint="default" w:ascii="Bodoni MT" w:hAnsi="Bodoni MT" w:cs="Bodoni MT"/>
+          <w:color w:val="auto"/>
+          <w:highlight w:val="none"/>
+          <w:lang w:val="en-IN"/>
+        </w:rPr>
+        <w:t xml:space="preserve">Internally it is handled by: </w:t>
+      </w:r>
+      <w:r>
+        <w:rPr>
+          <w:rFonts w:hint="default" w:ascii="Bodoni MT" w:hAnsi="Bodoni MT" w:cs="Bodoni MT"/>
           <w:b/>
           <w:bCs/>
-          <w:i w:val="0"/>
-          <w:iCs w:val="0"/>
-          <w:color w:val="auto"/>
+          <w:color w:val="C00000"/>
           <w:highlight w:val="none"/>
           <w:lang w:val="en-IN"/>
         </w:rPr>
-        <w:t>GET /oauth2/authorization/google</w:t>
+        <w:t>OAuth2AuthorizationRequestRedirectFilter</w:t>
       </w:r>
       <w:r>
         <w:rPr>
           <w:rFonts w:hint="default" w:ascii="Bodoni MT" w:hAnsi="Bodoni MT" w:cs="Bodoni MT"/>
           <w:b w:val="0"/>
           <w:bCs w:val="0"/>
-          <w:i w:val="0"/>
-          <w:iCs w:val="0"/>
-          <w:color w:val="auto"/>
-          <w:highlight w:val="none"/>
-          <w:lang w:val="en-IN"/>
-        </w:rPr>
-        <w:t xml:space="preserve">   (this is our backend’s path; not google’s)</w:t>
-      </w:r>
-    </w:p>
-    <w:p>
-      <w:pPr>
-        <w:keepNext w:val="0"/>
-        <w:keepLines w:val="0"/>
-        <w:widowControl/>
-        <w:numPr>
-          <w:ilvl w:val="1"/>
-          <w:numId w:val="11"/>
-        </w:numPr>
-        <w:suppressLineNumbers w:val="0"/>
-        <w:spacing w:before="0" w:beforeAutospacing="0" w:after="0" w:afterAutospacing="0" w:line="360" w:lineRule="auto"/>
-        <w:ind w:left="840" w:leftChars="0" w:right="0" w:hanging="420" w:firstLineChars="0"/>
-        <w:jc w:val="left"/>
-        <w:rPr>
-          <w:rFonts w:hint="default" w:ascii="Bodoni MT" w:hAnsi="Bodoni MT" w:cs="Bodoni MT"/>
-          <w:color w:val="auto"/>
-          <w:highlight w:val="none"/>
-        </w:rPr>
-      </w:pPr>
-      <w:r>
-        <w:rPr>
-          <w:rFonts w:hint="default" w:ascii="Bodoni MT" w:hAnsi="Bodoni MT" w:cs="Bodoni MT"/>
-          <w:b w:val="0"/>
-          <w:bCs w:val="0"/>
-          <w:i w:val="0"/>
-          <w:iCs w:val="0"/>
-          <w:color w:val="auto"/>
-          <w:highlight w:val="none"/>
-          <w:lang w:val="en-IN"/>
-        </w:rPr>
-        <w:t xml:space="preserve">We don’t write this end point by our self; this is </w:t>
-      </w:r>
-      <w:r>
-        <w:rPr>
-          <w:rFonts w:hint="default" w:ascii="Bodoni MT" w:hAnsi="Bodoni MT" w:cs="Bodoni MT"/>
-          <w:b/>
-          <w:bCs/>
-          <w:i w:val="0"/>
-          <w:iCs w:val="0"/>
-          <w:color w:val="auto"/>
-          <w:highlight w:val="none"/>
-          <w:lang w:val="en-IN"/>
-        </w:rPr>
-        <w:t>auto-created</w:t>
-      </w:r>
-      <w:r>
-        <w:rPr>
-          <w:rFonts w:hint="default" w:ascii="Bodoni MT" w:hAnsi="Bodoni MT" w:cs="Bodoni MT"/>
-          <w:b w:val="0"/>
-          <w:bCs w:val="0"/>
-          <w:i w:val="0"/>
-          <w:iCs w:val="0"/>
-          <w:color w:val="auto"/>
-          <w:highlight w:val="none"/>
-          <w:lang w:val="en-IN"/>
-        </w:rPr>
-        <w:t xml:space="preserve"> by </w:t>
-      </w:r>
-      <w:r>
-        <w:rPr>
-          <w:rFonts w:hint="default" w:ascii="Bodoni MT" w:hAnsi="Bodoni MT" w:cs="Bodoni MT"/>
-          <w:b w:val="0"/>
-          <w:bCs w:val="0"/>
-          <w:i w:val="0"/>
-          <w:iCs w:val="0"/>
-          <w:color w:val="7030A0"/>
-          <w:highlight w:val="none"/>
-          <w:lang w:val="en-IN"/>
-        </w:rPr>
-        <w:t>Spring Security OAuth2 Client</w:t>
-      </w:r>
-      <w:r>
-        <w:rPr>
-          <w:rFonts w:hint="default" w:ascii="Bodoni MT" w:hAnsi="Bodoni MT" w:cs="Bodoni MT"/>
-          <w:b w:val="0"/>
-          <w:bCs w:val="0"/>
-          <w:i w:val="0"/>
-          <w:iCs w:val="0"/>
-          <w:color w:val="auto"/>
-          <w:highlight w:val="none"/>
-          <w:lang w:val="en-IN"/>
-        </w:rPr>
-        <w:t>.</w:t>
-      </w:r>
-    </w:p>
-    <w:p>
-      <w:pPr>
-        <w:keepNext w:val="0"/>
-        <w:keepLines w:val="0"/>
-        <w:widowControl/>
-        <w:numPr>
-          <w:ilvl w:val="1"/>
-          <w:numId w:val="11"/>
-        </w:numPr>
-        <w:suppressLineNumbers w:val="0"/>
-        <w:spacing w:before="0" w:beforeAutospacing="0" w:after="0" w:afterAutospacing="0" w:line="360" w:lineRule="auto"/>
-        <w:ind w:left="840" w:leftChars="0" w:right="0" w:hanging="420" w:firstLineChars="0"/>
-        <w:jc w:val="left"/>
-        <w:rPr>
-          <w:rFonts w:hint="default" w:ascii="Bodoni MT" w:hAnsi="Bodoni MT" w:cs="Bodoni MT"/>
-          <w:color w:val="auto"/>
-          <w:highlight w:val="none"/>
-        </w:rPr>
-      </w:pPr>
-      <w:r>
-        <w:rPr>
-          <w:rFonts w:hint="default" w:ascii="Bodoni MT" w:hAnsi="Bodoni MT" w:cs="Bodoni MT"/>
-          <w:color w:val="auto"/>
-          <w:highlight w:val="none"/>
-          <w:lang w:val="en-IN"/>
-        </w:rPr>
-        <w:t xml:space="preserve">Internally it is handled by: </w:t>
-      </w:r>
-      <w:r>
-        <w:rPr>
-          <w:rFonts w:hint="default" w:ascii="Bodoni MT" w:hAnsi="Bodoni MT" w:cs="Bodoni MT"/>
-          <w:b/>
-          <w:bCs/>
-          <w:color w:val="auto"/>
-          <w:highlight w:val="none"/>
-          <w:lang w:val="en-IN"/>
-        </w:rPr>
-        <w:t>OAuth2AuthorizationRequestRedirectFilter</w:t>
-      </w:r>
-      <w:r>
-        <w:rPr>
-          <w:rFonts w:hint="default" w:ascii="Bodoni MT" w:hAnsi="Bodoni MT" w:cs="Bodoni MT"/>
-          <w:b w:val="0"/>
-          <w:bCs w:val="0"/>
-          <w:color w:val="auto"/>
+          <w:color w:val="C00000"/>
           <w:highlight w:val="none"/>
           <w:lang w:val="en-IN"/>
         </w:rPr>
@@ -1637,6 +1659,106 @@
     </w:p>
     <w:p>
       <w:pPr>
+        <w:keepNext w:val="0"/>
+        <w:keepLines w:val="0"/>
+        <w:widowControl/>
+        <w:numPr>
+          <w:ilvl w:val="1"/>
+          <w:numId w:val="11"/>
+        </w:numPr>
+        <w:suppressLineNumbers w:val="0"/>
+        <w:spacing w:before="0" w:beforeAutospacing="0" w:after="0" w:afterAutospacing="0" w:line="360" w:lineRule="auto"/>
+        <w:ind w:left="840" w:leftChars="0" w:right="0" w:hanging="420" w:firstLineChars="0"/>
+        <w:jc w:val="left"/>
+        <w:rPr>
+          <w:rFonts w:hint="default" w:ascii="Bodoni MT" w:hAnsi="Bodoni MT" w:cs="Bodoni MT"/>
+          <w:color w:val="auto"/>
+          <w:highlight w:val="none"/>
+          <w:u w:val="single"/>
+          <w:shd w:val="clear" w:color="auto" w:fill="auto"/>
+        </w:rPr>
+      </w:pPr>
+      <w:r>
+        <w:rPr>
+          <w:rFonts w:hint="default" w:ascii="Bodoni MT" w:hAnsi="Bodoni MT" w:cs="Bodoni MT"/>
+          <w:b w:val="0"/>
+          <w:bCs w:val="0"/>
+          <w:color w:val="auto"/>
+          <w:highlight w:val="none"/>
+          <w:u w:val="single"/>
+          <w:shd w:val="clear" w:color="auto" w:fill="auto"/>
+          <w:lang w:val="en-US"/>
+        </w:rPr>
+        <w:t xml:space="preserve">Mark </w:t>
+      </w:r>
+      <w:r>
+        <w:rPr>
+          <w:rFonts w:hint="default" w:ascii="Bodoni MT" w:hAnsi="Bodoni MT" w:cs="Bodoni MT"/>
+          <w:b/>
+          <w:bCs/>
+          <w:color w:val="0070C0"/>
+          <w:highlight w:val="none"/>
+          <w:u w:val="single"/>
+          <w:shd w:val="clear" w:color="auto" w:fill="auto"/>
+          <w:lang w:val="en-US"/>
+        </w:rPr>
+        <w:t>state</w:t>
+      </w:r>
+      <w:r>
+        <w:rPr>
+          <w:rFonts w:hint="default" w:ascii="Bodoni MT" w:hAnsi="Bodoni MT" w:cs="Bodoni MT"/>
+          <w:b w:val="0"/>
+          <w:bCs w:val="0"/>
+          <w:color w:val="auto"/>
+          <w:highlight w:val="none"/>
+          <w:u w:val="single"/>
+          <w:shd w:val="clear" w:color="auto" w:fill="auto"/>
+          <w:lang w:val="en-US"/>
+        </w:rPr>
+        <w:t xml:space="preserve"> and </w:t>
+      </w:r>
+      <w:r>
+        <w:rPr>
+          <w:rFonts w:hint="default" w:ascii="Bodoni MT" w:hAnsi="Bodoni MT" w:cs="Bodoni MT"/>
+          <w:b/>
+          <w:bCs/>
+          <w:color w:val="0070C0"/>
+          <w:highlight w:val="none"/>
+          <w:u w:val="single"/>
+          <w:shd w:val="clear" w:color="auto" w:fill="auto"/>
+          <w:lang w:val="en-US"/>
+        </w:rPr>
+        <w:t>code</w:t>
+      </w:r>
+      <w:r>
+        <w:rPr>
+          <w:rFonts w:hint="default" w:ascii="Bodoni MT" w:hAnsi="Bodoni MT" w:cs="Bodoni MT"/>
+          <w:b w:val="0"/>
+          <w:bCs w:val="0"/>
+          <w:color w:val="0070C0"/>
+          <w:highlight w:val="none"/>
+          <w:u w:val="single"/>
+          <w:shd w:val="clear" w:color="auto" w:fill="auto"/>
+          <w:lang w:val="en-US"/>
+        </w:rPr>
+        <w:t xml:space="preserve"> </w:t>
+      </w:r>
+      <w:r>
+        <w:rPr>
+          <w:rFonts w:hint="default" w:ascii="Bodoni MT" w:hAnsi="Bodoni MT" w:cs="Bodoni MT"/>
+          <w:b w:val="0"/>
+          <w:bCs w:val="0"/>
+          <w:color w:val="auto"/>
+          <w:highlight w:val="none"/>
+          <w:u w:val="single"/>
+          <w:shd w:val="clear" w:color="auto" w:fill="auto"/>
+          <w:lang w:val="en-US"/>
+        </w:rPr>
+        <w:t>here (code will be sent by google, state will be used to verify)</w:t>
+      </w:r>
+    </w:p>
+    <w:p>
+      <w:pPr>
         <w:rPr>
           <w:rFonts w:hint="default" w:ascii="Bodoni MT" w:hAnsi="Bodoni MT" w:cs="Bodoni MT"/>
           <w:color w:val="auto"/>
@@ -1793,7 +1915,51 @@
           <w:highlight w:val="none"/>
           <w:lang w:val="en-IN"/>
         </w:rPr>
-        <w:t>If response status is 3xx and Location header is present → automatically navigate to that URL.</w:t>
+        <w:t xml:space="preserve">If response status is </w:t>
+      </w:r>
+      <w:r>
+        <w:rPr>
+          <w:rFonts w:hint="default" w:ascii="Bodoni MT" w:hAnsi="Bodoni MT" w:cs="Bodoni MT"/>
+          <w:b/>
+          <w:bCs/>
+          <w:color w:val="0070C0"/>
+          <w:highlight w:val="none"/>
+          <w:lang w:val="en-IN"/>
+        </w:rPr>
+        <w:t>3xx</w:t>
+      </w:r>
+      <w:r>
+        <w:rPr>
+          <w:rFonts w:hint="default" w:ascii="Bodoni MT" w:hAnsi="Bodoni MT" w:cs="Bodoni MT"/>
+          <w:b/>
+          <w:bCs/>
+          <w:color w:val="C00000"/>
+          <w:highlight w:val="none"/>
+          <w:lang w:val="en-IN"/>
+        </w:rPr>
+        <w:t xml:space="preserve"> and </w:t>
+      </w:r>
+      <w:r>
+        <w:rPr>
+          <w:rFonts w:hint="default" w:ascii="Bodoni MT" w:hAnsi="Bodoni MT" w:cs="Bodoni MT"/>
+          <w:b/>
+          <w:bCs/>
+          <w:color w:val="0070C0"/>
+          <w:highlight w:val="none"/>
+          <w:lang w:val="en-IN"/>
+        </w:rPr>
+        <w:t>Location header</w:t>
+      </w:r>
+      <w:r>
+        <w:rPr>
+          <w:rFonts w:hint="default" w:ascii="Bodoni MT" w:hAnsi="Bodoni MT" w:cs="Bodoni MT"/>
+          <w:b/>
+          <w:bCs/>
+          <w:color w:val="C00000"/>
+          <w:highlight w:val="none"/>
+          <w:lang w:val="en-IN"/>
+        </w:rPr>
+        <w:t xml:space="preserve"> is present → automatically navigate to that URL.</w:t>
       </w:r>
     </w:p>
     <w:p>
@@ -2714,7 +2880,7 @@
           <w:rFonts w:hint="default" w:ascii="Bodoni MT" w:hAnsi="Bodoni MT" w:cs="Bodoni MT"/>
           <w:b/>
           <w:bCs/>
-          <w:color w:val="auto"/>
+          <w:color w:val="C00000"/>
           <w:highlight w:val="none"/>
           <w:lang w:val="en-IN"/>
         </w:rPr>
@@ -2870,14 +3036,14 @@
         <w:jc w:val="left"/>
         <w:rPr>
           <w:rFonts w:hint="default" w:ascii="Bodoni MT" w:hAnsi="Bodoni MT" w:cs="Bodoni MT"/>
-          <w:color w:val="auto"/>
+          <w:color w:val="C00000"/>
           <w:highlight w:val="none"/>
         </w:rPr>
       </w:pPr>
       <w:r>
         <w:rPr>
           <w:rFonts w:hint="default" w:ascii="Bodoni MT" w:hAnsi="Bodoni MT" w:cs="Bodoni MT"/>
-          <w:color w:val="auto"/>
+          <w:color w:val="C00000"/>
           <w:highlight w:val="none"/>
           <w:lang w:val="en-IN"/>
         </w:rPr>
@@ -2888,7 +3054,7 @@
           <w:rFonts w:hint="default" w:ascii="Bodoni MT" w:hAnsi="Bodoni MT" w:cs="Bodoni MT"/>
           <w:b/>
           <w:bCs/>
-          <w:color w:val="auto"/>
+          <w:color w:val="C00000"/>
           <w:highlight w:val="none"/>
           <w:lang w:val="en-IN"/>
         </w:rPr>
@@ -2899,29 +3065,51 @@
           <w:rFonts w:hint="default" w:ascii="Bodoni MT" w:hAnsi="Bodoni MT" w:cs="Bodoni MT"/>
           <w:b w:val="0"/>
           <w:bCs w:val="0"/>
-          <w:color w:val="auto"/>
+          <w:color w:val="C00000"/>
           <w:highlight w:val="none"/>
           <w:lang w:val="en-IN"/>
         </w:rPr>
-        <w:t xml:space="preserve"> matches, then continue; otherwise </w:t>
+        <w:t xml:space="preserve"> matches, then </w:t>
       </w:r>
       <w:r>
         <w:rPr>
           <w:rFonts w:hint="default" w:ascii="Bodoni MT" w:hAnsi="Bodoni MT" w:cs="Bodoni MT"/>
           <w:b/>
           <w:bCs/>
-          <w:color w:val="auto"/>
+          <w:color w:val="C00000"/>
           <w:highlight w:val="none"/>
           <w:lang w:val="en-IN"/>
         </w:rPr>
-        <w:t>reject</w:t>
+        <w:t>continue</w:t>
       </w:r>
       <w:r>
         <w:rPr>
           <w:rFonts w:hint="default" w:ascii="Bodoni MT" w:hAnsi="Bodoni MT" w:cs="Bodoni MT"/>
           <w:b w:val="0"/>
           <w:bCs w:val="0"/>
-          <w:color w:val="auto"/>
+          <w:color w:val="C00000"/>
+          <w:highlight w:val="none"/>
+          <w:lang w:val="en-IN"/>
+        </w:rPr>
+        <w:t xml:space="preserve">; otherwise </w:t>
+      </w:r>
+      <w:r>
+        <w:rPr>
+          <w:rFonts w:hint="default" w:ascii="Bodoni MT" w:hAnsi="Bodoni MT" w:cs="Bodoni MT"/>
+          <w:b/>
+          <w:bCs/>
+          <w:color w:val="C00000"/>
+          <w:highlight w:val="none"/>
+          <w:lang w:val="en-IN"/>
+        </w:rPr>
+        <w:t>reject</w:t>
+      </w:r>
+      <w:r>
+        <w:rPr>
+          <w:rFonts w:hint="default" w:ascii="Bodoni MT" w:hAnsi="Bodoni MT" w:cs="Bodoni MT"/>
+          <w:b w:val="0"/>
+          <w:bCs w:val="0"/>
+          <w:color w:val="C00000"/>
           <w:highlight w:val="none"/>
           <w:lang w:val="en-IN"/>
         </w:rPr>
@@ -3406,7 +3594,42 @@
           <w:color w:val="7030A0"/>
           <w:highlight w:val="none"/>
         </w:rPr>
-        <w:t xml:space="preserve">You “use” only the authorization code; the </w:t>
+        <w:t xml:space="preserve">You </w:t>
+      </w:r>
+      <w:r>
+        <w:rPr>
+          <w:rFonts w:hint="default" w:ascii="Bodoni MT" w:hAnsi="Bodoni MT" w:cs="Bodoni MT"/>
+          <w:color w:val="7030A0"/>
+          <w:highlight w:val="none"/>
+          <w:lang w:val="en-US"/>
+        </w:rPr>
+        <w:t>only use</w:t>
+      </w:r>
+      <w:r>
+        <w:rPr>
+          <w:rFonts w:hint="default" w:ascii="Bodoni MT" w:hAnsi="Bodoni MT" w:cs="Bodoni MT"/>
+          <w:color w:val="7030A0"/>
+          <w:highlight w:val="none"/>
+        </w:rPr>
+        <w:t xml:space="preserve"> the authorization </w:t>
+      </w:r>
+      <w:r>
+        <w:rPr>
+          <w:rFonts w:hint="default" w:ascii="Bodoni MT" w:hAnsi="Bodoni MT" w:cs="Bodoni MT"/>
+          <w:b/>
+          <w:bCs/>
+          <w:color w:val="7030A0"/>
+          <w:highlight w:val="none"/>
+        </w:rPr>
+        <w:t>code</w:t>
+      </w:r>
+      <w:r>
+        <w:rPr>
+          <w:rFonts w:hint="default" w:ascii="Bodoni MT" w:hAnsi="Bodoni MT" w:cs="Bodoni MT"/>
+          <w:color w:val="7030A0"/>
+          <w:highlight w:val="none"/>
+        </w:rPr>
+        <w:t xml:space="preserve">; the </w:t>
       </w:r>
       <w:r>
         <w:rPr>
@@ -4052,13 +4275,19 @@
         <w:jc w:val="left"/>
         <w:rPr>
           <w:rFonts w:hint="default" w:ascii="Bodoni MT" w:hAnsi="Bodoni MT" w:eastAsia="等线" w:cs="Bodoni MT"/>
-          <w:sz w:val="22"/>
-          <w:szCs w:val="22"/>
-        </w:rPr>
-      </w:pPr>
-      <w:r>
-        <w:rPr>
-          <w:rFonts w:hint="default" w:ascii="Bodoni MT" w:hAnsi="Bodoni MT" w:eastAsia="等线" w:cs="Bodoni MT"/>
+          <w:b/>
+          <w:bCs/>
+          <w:color w:val="0070C0"/>
+          <w:sz w:val="22"/>
+          <w:szCs w:val="22"/>
+        </w:rPr>
+      </w:pPr>
+      <w:r>
+        <w:rPr>
+          <w:rFonts w:hint="default" w:ascii="Bodoni MT" w:hAnsi="Bodoni MT" w:eastAsia="等线" w:cs="Bodoni MT"/>
+          <w:b/>
+          <w:bCs/>
+          <w:color w:val="0070C0"/>
           <w:sz w:val="22"/>
           <w:szCs w:val="22"/>
           <w:lang w:val="en-IN"/>
@@ -4147,6 +4376,7 @@
         <w:jc w:val="left"/>
         <w:rPr>
           <w:rFonts w:hint="default" w:ascii="Bodoni MT" w:hAnsi="Bodoni MT" w:eastAsia="等线" w:cs="Bodoni MT"/>
+          <w:color w:val="0070C0"/>
           <w:sz w:val="22"/>
           <w:szCs w:val="22"/>
         </w:rPr>
@@ -4156,6 +4386,7 @@
           <w:rFonts w:hint="default" w:ascii="Bodoni MT" w:hAnsi="Bodoni MT" w:eastAsia="等线" w:cs="Bodoni MT"/>
           <w:b/>
           <w:bCs/>
+          <w:color w:val="0070C0"/>
           <w:sz w:val="22"/>
           <w:szCs w:val="22"/>
           <w:lang w:val="en-IN"/>
@@ -4167,6 +4398,7 @@
           <w:rFonts w:hint="default" w:ascii="Bodoni MT" w:hAnsi="Bodoni MT" w:eastAsia="等线" w:cs="Bodoni MT"/>
           <w:b w:val="0"/>
           <w:bCs w:val="0"/>
+          <w:color w:val="0070C0"/>
           <w:sz w:val="22"/>
           <w:szCs w:val="22"/>
           <w:lang w:val="en-IN"/>
@@ -4178,6 +4410,7 @@
           <w:rFonts w:hint="default" w:ascii="Bodoni MT" w:hAnsi="Bodoni MT" w:eastAsia="等线" w:cs="Bodoni MT"/>
           <w:b/>
           <w:bCs/>
+          <w:color w:val="0070C0"/>
           <w:sz w:val="22"/>
           <w:szCs w:val="22"/>
           <w:lang w:val="en-IN"/>
@@ -4747,17 +4980,6 @@
     </w:p>
     <w:p>
       <w:pPr>
-        <w:keepNext w:val="0"/>
-        <w:keepLines w:val="0"/>
-        <w:widowControl/>
-        <w:numPr>
-          <w:ilvl w:val="0"/>
-          <w:numId w:val="13"/>
-        </w:numPr>
-        <w:suppressLineNumbers w:val="0"/>
-        <w:spacing w:before="0" w:beforeAutospacing="0" w:after="0" w:afterAutospacing="0" w:line="360" w:lineRule="auto"/>
-        <w:ind w:left="420" w:leftChars="0" w:right="0" w:hanging="420" w:firstLineChars="0"/>
-        <w:jc w:val="left"/>
         <w:rPr>
           <w:rFonts w:hint="default" w:ascii="Bodoni MT" w:hAnsi="Bodoni MT" w:eastAsia="等线" w:cs="Bodoni MT"/>
           <w:color w:val="002060"/>
@@ -4778,7 +5000,43 @@
           <w:u w:val="single"/>
           <w:lang w:val="en-IN" w:eastAsia="zh-CN" w:bidi="ar"/>
         </w:rPr>
-        <w:t xml:space="preserve">Application codes </w:t>
+        <w:br w:type="page"/>
+      </w:r>
+    </w:p>
+    <w:p>
+      <w:pPr>
+        <w:keepNext w:val="0"/>
+        <w:keepLines w:val="0"/>
+        <w:widowControl/>
+        <w:numPr>
+          <w:numId w:val="0"/>
+        </w:numPr>
+        <w:suppressLineNumbers w:val="0"/>
+        <w:spacing w:before="0" w:beforeAutospacing="0" w:after="0" w:afterAutospacing="0" w:line="360" w:lineRule="auto"/>
+        <w:ind w:leftChars="0" w:right="0" w:rightChars="0"/>
+        <w:jc w:val="center"/>
+        <w:rPr>
+          <w:rFonts w:hint="default" w:ascii="Bodoni MT" w:hAnsi="Bodoni MT" w:eastAsia="等线" w:cs="Bodoni MT"/>
+          <w:color w:val="002060"/>
+          <w:sz w:val="30"/>
+          <w:szCs w:val="30"/>
+          <w:lang w:val="en-US"/>
+        </w:rPr>
+      </w:pPr>
+      <w:r>
+        <w:rPr>
+          <w:rFonts w:hint="default" w:ascii="Bodoni MT" w:hAnsi="Bodoni MT" w:eastAsia="等线" w:cs="Bodoni MT"/>
+          <w:b/>
+          <w:bCs/>
+          <w:color w:val="002060"/>
+          <w:kern w:val="0"/>
+          <w:sz w:val="30"/>
+          <w:szCs w:val="30"/>
+          <w:highlight w:val="lightGray"/>
+          <w:u w:val="single"/>
+          <w:lang w:val="en-US" w:eastAsia="zh-CN" w:bidi="ar"/>
+        </w:rPr>
+        <w:t xml:space="preserve"> Implementation in Spring Boot Application </w:t>
       </w:r>
     </w:p>
     <w:p>
@@ -4814,6 +5072,7 @@
           <w:rFonts w:hint="default" w:ascii="Bodoni MT" w:hAnsi="Bodoni MT" w:eastAsia="等线" w:cs="Bodoni MT"/>
           <w:b/>
           <w:bCs/>
+          <w:color w:val="C00000"/>
           <w:sz w:val="22"/>
           <w:szCs w:val="22"/>
           <w:lang w:val="en-IN"/>
@@ -4825,11 +5084,23 @@
           <w:rFonts w:hint="default" w:ascii="Bodoni MT" w:hAnsi="Bodoni MT" w:eastAsia="等线" w:cs="Bodoni MT"/>
           <w:b w:val="0"/>
           <w:bCs w:val="0"/>
-          <w:sz w:val="22"/>
-          <w:szCs w:val="22"/>
-          <w:lang w:val="en-IN"/>
-        </w:rPr>
-        <w:t xml:space="preserve"> filter in the custom filter chain</w:t>
+          <w:color w:val="C00000"/>
+          <w:sz w:val="22"/>
+          <w:szCs w:val="22"/>
+          <w:lang w:val="en-IN"/>
+        </w:rPr>
+        <w:t xml:space="preserve"> </w:t>
+      </w:r>
+      <w:r>
+        <w:rPr>
+          <w:rFonts w:hint="default" w:ascii="Bodoni MT" w:hAnsi="Bodoni MT" w:eastAsia="等线" w:cs="Bodoni MT"/>
+          <w:b w:val="0"/>
+          <w:bCs w:val="0"/>
+          <w:sz w:val="22"/>
+          <w:szCs w:val="22"/>
+          <w:lang w:val="en-IN"/>
+        </w:rPr>
+        <w:t>filter in the custom filter chain</w:t>
       </w:r>
     </w:p>
     <w:p>
@@ -4979,7 +5250,7 @@
           <w:rFonts w:hint="default" w:ascii="Bodoni MT" w:hAnsi="Bodoni MT" w:eastAsia="等线"/>
           <w:b/>
           <w:bCs/>
-          <w:color w:val="002060"/>
+          <w:color w:val="auto"/>
           <w:sz w:val="22"/>
           <w:szCs w:val="22"/>
           <w:lang w:val="en-IN"/>
@@ -5199,6 +5470,7 @@
           <w:rFonts w:hint="default" w:ascii="Bodoni MT" w:hAnsi="Bodoni MT" w:eastAsia="等线" w:cs="Bodoni MT"/>
           <w:b/>
           <w:bCs/>
+          <w:color w:val="C00000"/>
           <w:sz w:val="22"/>
           <w:szCs w:val="22"/>
           <w:lang w:val="en-IN"/>
@@ -5210,11 +5482,23 @@
           <w:rFonts w:hint="default" w:ascii="Bodoni MT" w:hAnsi="Bodoni MT" w:eastAsia="等线" w:cs="Bodoni MT"/>
           <w:b w:val="0"/>
           <w:bCs w:val="0"/>
-          <w:sz w:val="22"/>
-          <w:szCs w:val="22"/>
-          <w:lang w:val="en-IN"/>
-        </w:rPr>
-        <w:t xml:space="preserve"> class and overriding the method </w:t>
+          <w:color w:val="C00000"/>
+          <w:sz w:val="22"/>
+          <w:szCs w:val="22"/>
+          <w:lang w:val="en-IN"/>
+        </w:rPr>
+        <w:t xml:space="preserve"> </w:t>
+      </w:r>
+      <w:r>
+        <w:rPr>
+          <w:rFonts w:hint="default" w:ascii="Bodoni MT" w:hAnsi="Bodoni MT" w:eastAsia="等线" w:cs="Bodoni MT"/>
+          <w:b w:val="0"/>
+          <w:bCs w:val="0"/>
+          <w:sz w:val="22"/>
+          <w:szCs w:val="22"/>
+          <w:lang w:val="en-IN"/>
+        </w:rPr>
+        <w:t xml:space="preserve">class and overriding the method </w:t>
       </w:r>
       <w:r>
         <w:rPr>
@@ -5480,7 +5764,25 @@
           <w:szCs w:val="22"/>
           <w:lang w:val="en-IN"/>
         </w:rPr>
-        <w:t xml:space="preserve">I just checked if the user is present in the database, if present then do signup otherwise just create </w:t>
+        <w:t>I just checked if the user is present in the database, if present then do sign</w:t>
+      </w:r>
+      <w:r>
+        <w:rPr>
+          <w:rFonts w:hint="default" w:ascii="Bodoni MT" w:hAnsi="Bodoni MT" w:eastAsia="等线" w:cs="Bodoni MT"/>
+          <w:sz w:val="22"/>
+          <w:szCs w:val="22"/>
+          <w:lang w:val="en-US"/>
+        </w:rPr>
+        <w:t>-</w:t>
+      </w:r>
+      <w:r>
+        <w:rPr>
+          <w:rFonts w:hint="default" w:ascii="Bodoni MT" w:hAnsi="Bodoni MT" w:eastAsia="等线" w:cs="Bodoni MT"/>
+          <w:sz w:val="22"/>
+          <w:szCs w:val="22"/>
+          <w:lang w:val="en-IN"/>
+        </w:rPr>
+        <w:t xml:space="preserve">up otherwise just create </w:t>
       </w:r>
       <w:r>
         <w:rPr>
@@ -8647,37 +8949,6 @@
         <w:keepLines w:val="0"/>
         <w:widowControl/>
         <w:numPr>
-          <w:numId w:val="0"/>
-        </w:numPr>
-        <w:suppressLineNumbers w:val="0"/>
-        <w:spacing w:before="0" w:beforeAutospacing="0" w:after="0" w:afterAutospacing="0" w:line="360" w:lineRule="auto"/>
-        <w:ind w:leftChars="0" w:right="0" w:rightChars="0"/>
-        <w:jc w:val="left"/>
-        <w:rPr>
-          <w:rFonts w:hint="default" w:ascii="Bodoni MT" w:hAnsi="Bodoni MT" w:cs="Bodoni MT"/>
-        </w:rPr>
-      </w:pPr>
-    </w:p>
-    <w:p>
-      <w:pPr>
-        <w:rPr>
-          <w:rFonts w:hint="default" w:ascii="Bodoni MT" w:hAnsi="Bodoni MT" w:cs="Bodoni MT"/>
-        </w:rPr>
-      </w:pPr>
-      <w:r>
-        <w:rPr>
-          <w:rFonts w:hint="default" w:ascii="Bodoni MT" w:hAnsi="Bodoni MT" w:cs="Bodoni MT"/>
-          <w:lang w:val="en-IN"/>
-        </w:rPr>
-        <w:br w:type="page"/>
-      </w:r>
-    </w:p>
-    <w:p>
-      <w:pPr>
-        <w:keepNext w:val="0"/>
-        <w:keepLines w:val="0"/>
-        <w:widowControl/>
-        <w:numPr>
           <w:ilvl w:val="0"/>
           <w:numId w:val="0"/>
         </w:numPr>
@@ -8687,19 +8958,270 @@
         <w:jc w:val="left"/>
         <w:rPr>
           <w:rFonts w:hint="default" w:ascii="Bodoni MT" w:hAnsi="Bodoni MT" w:cs="Bodoni MT"/>
-          <w:lang w:val="en-IN"/>
-        </w:rPr>
-      </w:pPr>
-      <w:r>
-        <w:rPr>
-          <w:rFonts w:hint="default" w:ascii="Bodoni MT" w:hAnsi="Bodoni MT" w:cs="Bodoni MT"/>
-          <w:lang w:val="en-IN"/>
+        </w:rPr>
+      </w:pPr>
+    </w:p>
+    <w:p>
+      <w:pPr>
+        <w:rPr>
+          <w:rFonts w:hint="default" w:ascii="Bodoni MT" w:hAnsi="Bodoni MT" w:cs="Bodoni MT"/>
+        </w:rPr>
+      </w:pPr>
+      <w:r>
+        <w:rPr>
+          <w:rFonts w:hint="default" w:ascii="Bodoni MT" w:hAnsi="Bodoni MT" w:cs="Bodoni MT"/>
+          <w:lang w:val="en-IN"/>
+        </w:rPr>
+        <w:br w:type="page"/>
+      </w:r>
+    </w:p>
+    <w:p>
+      <w:pPr>
+        <w:keepNext w:val="0"/>
+        <w:keepLines w:val="0"/>
+        <w:widowControl/>
+        <w:numPr>
+          <w:ilvl w:val="0"/>
+          <w:numId w:val="13"/>
+        </w:numPr>
+        <w:suppressLineNumbers w:val="0"/>
+        <w:spacing w:before="0" w:beforeAutospacing="0" w:after="0" w:afterAutospacing="0" w:line="360" w:lineRule="auto"/>
+        <w:ind w:left="420" w:leftChars="0" w:right="0" w:hanging="420" w:firstLineChars="0"/>
+        <w:jc w:val="left"/>
+        <w:rPr>
+          <w:rFonts w:hint="default" w:ascii="Bodoni MT" w:hAnsi="Bodoni MT" w:eastAsia="等线" w:cs="Bodoni MT"/>
+          <w:b/>
+          <w:bCs/>
+          <w:sz w:val="22"/>
+          <w:szCs w:val="22"/>
+          <w:u w:val="single"/>
+        </w:rPr>
+      </w:pPr>
+      <w:r>
+        <w:rPr>
+          <w:rFonts w:hint="default" w:ascii="Bodoni MT" w:hAnsi="Bodoni MT" w:eastAsia="等线" w:cs="Bodoni MT"/>
+          <w:b/>
+          <w:bCs/>
+          <w:color w:val="auto"/>
+          <w:kern w:val="0"/>
+          <w:sz w:val="22"/>
+          <w:szCs w:val="22"/>
+          <w:u w:val="single"/>
+          <w:lang w:val="en-US" w:eastAsia="zh-CN" w:bidi="ar"/>
+        </w:rPr>
+        <w:t>OAuth2 work-flow in general  (I am taking google as OAuth2 provider)</w:t>
+      </w:r>
+    </w:p>
+    <w:p>
+      <w:pPr>
+        <w:keepNext w:val="0"/>
+        <w:keepLines w:val="0"/>
+        <w:widowControl/>
+        <w:numPr>
+          <w:ilvl w:val="1"/>
+          <w:numId w:val="13"/>
+        </w:numPr>
+        <w:suppressLineNumbers w:val="0"/>
+        <w:spacing w:before="0" w:beforeAutospacing="0" w:after="0" w:afterAutospacing="0" w:line="360" w:lineRule="auto"/>
+        <w:ind w:left="840" w:leftChars="0" w:right="0" w:hanging="420" w:firstLineChars="0"/>
+        <w:jc w:val="left"/>
+        <w:rPr>
+          <w:rFonts w:hint="default" w:ascii="Bodoni MT" w:hAnsi="Bodoni MT" w:eastAsia="等线" w:cs="Bodoni MT"/>
+          <w:sz w:val="22"/>
+          <w:szCs w:val="22"/>
+        </w:rPr>
+      </w:pPr>
+      <w:r>
+        <w:rPr>
+          <w:rFonts w:hint="default" w:ascii="Bodoni MT" w:hAnsi="Bodoni MT" w:eastAsia="等线" w:cs="Bodoni MT"/>
+          <w:color w:val="auto"/>
+          <w:kern w:val="0"/>
+          <w:sz w:val="22"/>
+          <w:szCs w:val="22"/>
+          <w:lang w:val="en-US" w:eastAsia="zh-CN" w:bidi="ar"/>
+        </w:rPr>
+        <w:t>2 backend are involved here: google’s backend, our application backend</w:t>
+      </w:r>
+    </w:p>
+    <w:p>
+      <w:pPr>
+        <w:keepNext w:val="0"/>
+        <w:keepLines w:val="0"/>
+        <w:widowControl/>
+        <w:numPr>
+          <w:ilvl w:val="1"/>
+          <w:numId w:val="13"/>
+        </w:numPr>
+        <w:suppressLineNumbers w:val="0"/>
+        <w:spacing w:before="0" w:beforeAutospacing="0" w:after="0" w:afterAutospacing="0" w:line="360" w:lineRule="auto"/>
+        <w:ind w:left="840" w:leftChars="0" w:right="0" w:hanging="420" w:firstLineChars="0"/>
+        <w:jc w:val="left"/>
+        <w:rPr>
+          <w:rFonts w:hint="default" w:ascii="Bodoni MT" w:hAnsi="Bodoni MT" w:eastAsia="等线" w:cs="Bodoni MT"/>
+          <w:sz w:val="22"/>
+          <w:szCs w:val="22"/>
+        </w:rPr>
+      </w:pPr>
+      <w:r>
+        <w:rPr>
+          <w:rFonts w:hint="default" w:ascii="Bodoni MT" w:hAnsi="Bodoni MT" w:eastAsia="等线" w:cs="Bodoni MT"/>
+          <w:color w:val="auto"/>
+          <w:kern w:val="0"/>
+          <w:sz w:val="22"/>
+          <w:szCs w:val="22"/>
+          <w:lang w:val="en-US" w:eastAsia="zh-CN" w:bidi="ar"/>
+        </w:rPr>
+        <w:t>first, when the signin with google (or any other provider) button is clicked in the frontend, it’ll call a GET request to Application Backend</w:t>
+      </w:r>
+    </w:p>
+    <w:p>
+      <w:pPr>
+        <w:keepNext w:val="0"/>
+        <w:keepLines w:val="0"/>
+        <w:widowControl/>
+        <w:numPr>
+          <w:ilvl w:val="2"/>
+          <w:numId w:val="13"/>
+        </w:numPr>
+        <w:suppressLineNumbers w:val="0"/>
+        <w:spacing w:before="0" w:beforeAutospacing="0" w:after="0" w:afterAutospacing="0" w:line="360" w:lineRule="auto"/>
+        <w:ind w:left="1260" w:leftChars="0" w:right="0" w:hanging="420" w:firstLineChars="0"/>
+        <w:jc w:val="left"/>
+        <w:rPr>
+          <w:rFonts w:hint="default" w:ascii="Bodoni MT" w:hAnsi="Bodoni MT" w:eastAsia="等线" w:cs="Bodoni MT"/>
+          <w:sz w:val="22"/>
+          <w:szCs w:val="22"/>
+        </w:rPr>
+      </w:pPr>
+      <w:r>
+        <w:rPr>
+          <w:rFonts w:hint="default" w:ascii="Bodoni MT" w:hAnsi="Bodoni MT" w:eastAsia="等线" w:cs="Bodoni MT"/>
+          <w:color w:val="auto"/>
+          <w:kern w:val="0"/>
+          <w:sz w:val="22"/>
+          <w:szCs w:val="22"/>
+          <w:lang w:val="en-US" w:eastAsia="zh-CN" w:bidi="ar"/>
+        </w:rPr>
+        <w:t>in spring, this url is: oauth2/authorization/google</w:t>
+      </w:r>
+    </w:p>
+    <w:p>
+      <w:pPr>
+        <w:keepNext w:val="0"/>
+        <w:keepLines w:val="0"/>
+        <w:widowControl/>
+        <w:numPr>
+          <w:ilvl w:val="1"/>
+          <w:numId w:val="13"/>
+        </w:numPr>
+        <w:suppressLineNumbers w:val="0"/>
+        <w:spacing w:before="0" w:beforeAutospacing="0" w:after="0" w:afterAutospacing="0" w:line="360" w:lineRule="auto"/>
+        <w:ind w:left="840" w:leftChars="0" w:right="0" w:hanging="420" w:firstLineChars="0"/>
+        <w:jc w:val="left"/>
+        <w:rPr>
+          <w:rFonts w:hint="default" w:ascii="Bodoni MT" w:hAnsi="Bodoni MT" w:eastAsia="等线" w:cs="Bodoni MT"/>
+          <w:sz w:val="22"/>
+          <w:szCs w:val="22"/>
+        </w:rPr>
+      </w:pPr>
+      <w:r>
+        <w:rPr>
+          <w:rFonts w:hint="default" w:ascii="Bodoni MT" w:hAnsi="Bodoni MT" w:eastAsia="等线" w:cs="Bodoni MT"/>
+          <w:color w:val="auto"/>
+          <w:kern w:val="0"/>
+          <w:sz w:val="22"/>
+          <w:szCs w:val="22"/>
+          <w:lang w:val="en-US" w:eastAsia="zh-CN" w:bidi="ar"/>
+        </w:rPr>
+        <w:t>now, Application Backend creates a proper url having client_id, client_secret, redirect_uri, state etc etc.</w:t>
+      </w:r>
+    </w:p>
+    <w:p>
+      <w:pPr>
+        <w:keepNext w:val="0"/>
+        <w:keepLines w:val="0"/>
+        <w:widowControl/>
+        <w:numPr>
+          <w:ilvl w:val="2"/>
+          <w:numId w:val="13"/>
+        </w:numPr>
+        <w:suppressLineNumbers w:val="0"/>
+        <w:spacing w:before="0" w:beforeAutospacing="0" w:after="0" w:afterAutospacing="0" w:line="360" w:lineRule="auto"/>
+        <w:ind w:left="1260" w:leftChars="0" w:right="0" w:hanging="420" w:firstLineChars="0"/>
+        <w:jc w:val="left"/>
+        <w:rPr>
+          <w:rFonts w:hint="default" w:ascii="Bodoni MT" w:hAnsi="Bodoni MT" w:eastAsia="等线" w:cs="Bodoni MT"/>
+          <w:sz w:val="22"/>
+          <w:szCs w:val="22"/>
+        </w:rPr>
+      </w:pPr>
+      <w:r>
+        <w:rPr>
+          <w:rFonts w:hint="default" w:ascii="Bodoni MT" w:hAnsi="Bodoni MT" w:eastAsia="等线" w:cs="Bodoni MT"/>
+          <w:color w:val="auto"/>
+          <w:kern w:val="0"/>
+          <w:sz w:val="22"/>
+          <w:szCs w:val="22"/>
+          <w:lang w:val="en-US" w:eastAsia="zh-CN" w:bidi="ar"/>
+        </w:rPr>
+        <w:t>note redirect_uri and state here, it’ll be used later....</w:t>
+      </w:r>
+    </w:p>
+    <w:p>
+      <w:pPr>
+        <w:keepNext w:val="0"/>
+        <w:keepLines w:val="0"/>
+        <w:widowControl/>
+        <w:numPr>
+          <w:ilvl w:val="2"/>
+          <w:numId w:val="13"/>
+        </w:numPr>
+        <w:suppressLineNumbers w:val="0"/>
+        <w:spacing w:before="0" w:beforeAutospacing="0" w:after="0" w:afterAutospacing="0" w:line="360" w:lineRule="auto"/>
+        <w:ind w:left="1260" w:leftChars="0" w:right="0" w:hanging="420" w:firstLineChars="0"/>
+        <w:jc w:val="left"/>
+        <w:rPr>
+          <w:rFonts w:hint="default" w:ascii="Bodoni MT" w:hAnsi="Bodoni MT" w:eastAsia="等线" w:cs="Bodoni MT"/>
+          <w:sz w:val="22"/>
+          <w:szCs w:val="22"/>
+        </w:rPr>
+      </w:pPr>
+      <w:r>
+        <w:rPr>
+          <w:rFonts w:hint="default" w:ascii="Bodoni MT" w:hAnsi="Bodoni MT" w:eastAsia="等线" w:cs="Bodoni MT"/>
+          <w:color w:val="auto"/>
+          <w:kern w:val="0"/>
+          <w:sz w:val="22"/>
+          <w:szCs w:val="22"/>
+          <w:lang w:val="en-US" w:eastAsia="zh-CN" w:bidi="ar"/>
+        </w:rPr>
+        <w:t>that URL is send to the frontend with http status code 3xx (which is meant for redirect)</w:t>
+      </w:r>
+      <w:r>
+        <w:rPr>
+          <w:rFonts w:hint="default" w:ascii="Bodoni MT" w:hAnsi="Bodoni MT" w:eastAsia="等线" w:cs="Bodoni MT"/>
+          <w:color w:val="auto"/>
+          <w:kern w:val="0"/>
+          <w:sz w:val="22"/>
+          <w:szCs w:val="22"/>
+          <w:lang w:val="en-US" w:eastAsia="zh-CN" w:bidi="ar"/>
+        </w:rPr>
+        <w:br w:type="textWrapping"/>
+      </w:r>
+      <w:r>
+        <w:rPr>
+          <w:rFonts w:hint="default" w:ascii="Calibri" w:hAnsi="Calibri" w:eastAsia="等线" w:cs="Bodoni MT"/>
+          <w:color w:val="auto"/>
+          <w:kern w:val="0"/>
+          <w:sz w:val="22"/>
+          <w:szCs w:val="22"/>
+          <w:lang w:val="en-US" w:eastAsia="zh-CN" w:bidi="ar"/>
         </w:rPr>
         <w:drawing>
           <wp:inline distT="0" distB="0" distL="114300" distR="114300">
-            <wp:extent cx="6654800" cy="6068695"/>
-            <wp:effectExtent l="0" t="0" r="0" b="0"/>
-            <wp:docPr id="13" name="Picture 13" descr="1_oauth_in_general"/>
+            <wp:extent cx="4248150" cy="1171575"/>
+            <wp:effectExtent l="0" t="0" r="6350" b="9525"/>
+            <wp:docPr id="35" name="Picture 2" descr="IMG_256"/>
             <wp:cNvGraphicFramePr>
               <a:graphicFrameLocks xmlns:a="http://schemas.openxmlformats.org/drawingml/2006/main" noChangeAspect="1"/>
             </wp:cNvGraphicFramePr>
@@ -8707,7 +9229,7 @@
               <a:graphicData uri="http://schemas.openxmlformats.org/drawingml/2006/picture">
                 <pic:pic xmlns:pic="http://schemas.openxmlformats.org/drawingml/2006/picture">
                   <pic:nvPicPr>
-                    <pic:cNvPr id="13" name="Picture 13" descr="1_oauth_in_general"/>
+                    <pic:cNvPr id="35" name="Picture 2" descr="IMG_256"/>
                     <pic:cNvPicPr>
                       <a:picLocks noChangeAspect="1"/>
                     </pic:cNvPicPr>
@@ -8721,11 +9243,15 @@
                   <pic:spPr>
                     <a:xfrm>
                       <a:off x="0" y="0"/>
-                      <a:ext cx="6654800" cy="6068695"/>
+                      <a:ext cx="4248150" cy="1171575"/>
                     </a:xfrm>
                     <a:prstGeom prst="rect">
                       <a:avLst/>
                     </a:prstGeom>
+                    <a:noFill/>
+                    <a:ln w="9525">
+                      <a:noFill/>
+                    </a:ln>
                   </pic:spPr>
                 </pic:pic>
               </a:graphicData>
@@ -8733,6 +9259,263 @@
           </wp:inline>
         </w:drawing>
       </w:r>
+    </w:p>
+    <w:p>
+      <w:pPr>
+        <w:keepNext w:val="0"/>
+        <w:keepLines w:val="0"/>
+        <w:widowControl/>
+        <w:numPr>
+          <w:ilvl w:val="2"/>
+          <w:numId w:val="13"/>
+        </w:numPr>
+        <w:suppressLineNumbers w:val="0"/>
+        <w:spacing w:before="0" w:beforeAutospacing="0" w:after="0" w:afterAutospacing="0" w:line="360" w:lineRule="auto"/>
+        <w:ind w:left="1260" w:leftChars="0" w:right="0" w:hanging="420" w:firstLineChars="0"/>
+        <w:jc w:val="left"/>
+        <w:rPr>
+          <w:rFonts w:hint="default" w:ascii="Bodoni MT" w:hAnsi="Bodoni MT" w:eastAsia="等线" w:cs="Bodoni MT"/>
+          <w:sz w:val="22"/>
+          <w:szCs w:val="22"/>
+        </w:rPr>
+      </w:pPr>
+      <w:r>
+        <w:rPr>
+          <w:rFonts w:hint="default" w:ascii="Bodoni MT" w:hAnsi="Bodoni MT" w:eastAsia="等线" w:cs="Bodoni MT"/>
+          <w:color w:val="auto"/>
+          <w:kern w:val="0"/>
+          <w:sz w:val="22"/>
+          <w:szCs w:val="22"/>
+          <w:lang w:val="en-US" w:eastAsia="zh-CN" w:bidi="ar"/>
+        </w:rPr>
+        <w:t>every browser's default behaviour is that it the response contains http status code 3xx and there is a location field there, then it'll redirect it to that location; there is no involvement of frontend here, its completely at the browser level.</w:t>
+      </w:r>
+    </w:p>
+    <w:p>
+      <w:pPr>
+        <w:keepNext w:val="0"/>
+        <w:keepLines w:val="0"/>
+        <w:widowControl/>
+        <w:numPr>
+          <w:ilvl w:val="1"/>
+          <w:numId w:val="13"/>
+        </w:numPr>
+        <w:suppressLineNumbers w:val="0"/>
+        <w:spacing w:before="0" w:beforeAutospacing="0" w:after="0" w:afterAutospacing="0" w:line="360" w:lineRule="auto"/>
+        <w:ind w:left="840" w:leftChars="0" w:right="0" w:hanging="420" w:firstLineChars="0"/>
+        <w:jc w:val="left"/>
+        <w:rPr>
+          <w:rFonts w:hint="default" w:ascii="Bodoni MT" w:hAnsi="Bodoni MT" w:eastAsia="等线" w:cs="Bodoni MT"/>
+          <w:sz w:val="22"/>
+          <w:szCs w:val="22"/>
+        </w:rPr>
+      </w:pPr>
+      <w:r>
+        <w:rPr>
+          <w:rFonts w:hint="default" w:ascii="Bodoni MT" w:hAnsi="Bodoni MT" w:eastAsia="等线" w:cs="Bodoni MT"/>
+          <w:color w:val="auto"/>
+          <w:kern w:val="0"/>
+          <w:sz w:val="22"/>
+          <w:szCs w:val="22"/>
+          <w:lang w:val="en-US" w:eastAsia="zh-CN" w:bidi="ar"/>
+        </w:rPr>
+        <w:t>now the browser will redirect to accounts.google.com/..... and user will get a screen to select the google account, and grant the consents.</w:t>
+      </w:r>
+    </w:p>
+    <w:p>
+      <w:pPr>
+        <w:keepNext w:val="0"/>
+        <w:keepLines w:val="0"/>
+        <w:widowControl/>
+        <w:numPr>
+          <w:ilvl w:val="1"/>
+          <w:numId w:val="13"/>
+        </w:numPr>
+        <w:suppressLineNumbers w:val="0"/>
+        <w:spacing w:before="0" w:beforeAutospacing="0" w:after="0" w:afterAutospacing="0" w:line="360" w:lineRule="auto"/>
+        <w:ind w:left="840" w:leftChars="0" w:right="0" w:hanging="420" w:firstLineChars="0"/>
+        <w:jc w:val="left"/>
+        <w:rPr>
+          <w:rFonts w:hint="default" w:ascii="Bodoni MT" w:hAnsi="Bodoni MT" w:eastAsia="等线" w:cs="Bodoni MT"/>
+          <w:sz w:val="22"/>
+          <w:szCs w:val="22"/>
+        </w:rPr>
+      </w:pPr>
+      <w:r>
+        <w:rPr>
+          <w:rFonts w:hint="default" w:ascii="Bodoni MT" w:hAnsi="Bodoni MT" w:eastAsia="等线" w:cs="Bodoni MT"/>
+          <w:color w:val="auto"/>
+          <w:kern w:val="0"/>
+          <w:sz w:val="22"/>
+          <w:szCs w:val="22"/>
+          <w:lang w:val="en-US" w:eastAsia="zh-CN" w:bidi="ar"/>
+        </w:rPr>
+        <w:t>After authenticating successfully, google will send a response (3xx and location) and location will contain that redirect_uri which was sent earlier.</w:t>
+      </w:r>
+    </w:p>
+    <w:p>
+      <w:pPr>
+        <w:keepNext w:val="0"/>
+        <w:keepLines w:val="0"/>
+        <w:widowControl/>
+        <w:numPr>
+          <w:ilvl w:val="1"/>
+          <w:numId w:val="13"/>
+        </w:numPr>
+        <w:suppressLineNumbers w:val="0"/>
+        <w:spacing w:before="0" w:beforeAutospacing="0" w:after="0" w:afterAutospacing="0" w:line="360" w:lineRule="auto"/>
+        <w:ind w:left="840" w:leftChars="0" w:right="0" w:hanging="420" w:firstLineChars="0"/>
+        <w:jc w:val="left"/>
+        <w:rPr>
+          <w:rFonts w:hint="default" w:ascii="Bodoni MT" w:hAnsi="Bodoni MT" w:eastAsia="等线" w:cs="Bodoni MT"/>
+          <w:sz w:val="22"/>
+          <w:szCs w:val="22"/>
+        </w:rPr>
+      </w:pPr>
+      <w:r>
+        <w:rPr>
+          <w:rFonts w:hint="default" w:ascii="Bodoni MT" w:hAnsi="Bodoni MT" w:eastAsia="等线" w:cs="Bodoni MT"/>
+          <w:color w:val="auto"/>
+          <w:kern w:val="0"/>
+          <w:sz w:val="22"/>
+          <w:szCs w:val="22"/>
+          <w:lang w:val="en-US" w:eastAsia="zh-CN" w:bidi="ar"/>
+        </w:rPr>
+        <w:t>so now, browser will redirect to that redirect_uri which goes to Application Backend.</w:t>
+      </w:r>
+    </w:p>
+    <w:p>
+      <w:pPr>
+        <w:keepNext w:val="0"/>
+        <w:keepLines w:val="0"/>
+        <w:widowControl/>
+        <w:numPr>
+          <w:ilvl w:val="1"/>
+          <w:numId w:val="13"/>
+        </w:numPr>
+        <w:suppressLineNumbers w:val="0"/>
+        <w:spacing w:before="0" w:beforeAutospacing="0" w:after="0" w:afterAutospacing="0" w:line="360" w:lineRule="auto"/>
+        <w:ind w:left="840" w:leftChars="0" w:right="0" w:hanging="420" w:firstLineChars="0"/>
+        <w:jc w:val="left"/>
+        <w:rPr>
+          <w:rFonts w:hint="default" w:ascii="Bodoni MT" w:hAnsi="Bodoni MT" w:eastAsia="等线" w:cs="Bodoni MT"/>
+          <w:sz w:val="22"/>
+          <w:szCs w:val="22"/>
+        </w:rPr>
+      </w:pPr>
+      <w:r>
+        <w:rPr>
+          <w:rFonts w:hint="default" w:ascii="Bodoni MT" w:hAnsi="Bodoni MT" w:eastAsia="等线" w:cs="Bodoni MT"/>
+          <w:color w:val="auto"/>
+          <w:kern w:val="0"/>
+          <w:sz w:val="22"/>
+          <w:szCs w:val="22"/>
+          <w:lang w:val="en-US" w:eastAsia="zh-CN" w:bidi="ar"/>
+        </w:rPr>
+        <w:t xml:space="preserve">this redirect_uri will be </w:t>
+      </w:r>
+    </w:p>
+    <w:p>
+      <w:pPr>
+        <w:keepNext w:val="0"/>
+        <w:keepLines w:val="0"/>
+        <w:widowControl/>
+        <w:numPr>
+          <w:ilvl w:val="2"/>
+          <w:numId w:val="13"/>
+        </w:numPr>
+        <w:suppressLineNumbers w:val="0"/>
+        <w:spacing w:before="0" w:beforeAutospacing="0" w:after="0" w:afterAutospacing="0" w:line="360" w:lineRule="auto"/>
+        <w:ind w:left="1260" w:leftChars="0" w:right="0" w:hanging="420" w:firstLineChars="0"/>
+        <w:jc w:val="left"/>
+        <w:rPr>
+          <w:rFonts w:hint="default" w:ascii="Bodoni MT" w:hAnsi="Bodoni MT" w:eastAsia="等线" w:cs="Bodoni MT"/>
+          <w:sz w:val="22"/>
+          <w:szCs w:val="22"/>
+        </w:rPr>
+      </w:pPr>
+      <w:r>
+        <w:rPr>
+          <w:rFonts w:hint="default" w:ascii="Bodoni MT" w:hAnsi="Bodoni MT" w:eastAsia="Bodoni MT" w:cs="Bodoni MT"/>
+          <w:color w:val="auto"/>
+          <w:kern w:val="0"/>
+          <w:sz w:val="22"/>
+          <w:szCs w:val="22"/>
+          <w:lang w:val="en-US" w:eastAsia="zh-CN" w:bidi="ar"/>
+        </w:rPr>
+        <w:t>“https://www.your-backend.com/login/oauth2/code/google?code=abc&amp;state=xyz”</w:t>
+      </w:r>
+    </w:p>
+    <w:p>
+      <w:pPr>
+        <w:keepNext w:val="0"/>
+        <w:keepLines w:val="0"/>
+        <w:widowControl/>
+        <w:numPr>
+          <w:ilvl w:val="1"/>
+          <w:numId w:val="13"/>
+        </w:numPr>
+        <w:suppressLineNumbers w:val="0"/>
+        <w:spacing w:before="0" w:beforeAutospacing="0" w:after="0" w:afterAutospacing="0" w:line="360" w:lineRule="auto"/>
+        <w:ind w:left="840" w:leftChars="0" w:right="0" w:hanging="420" w:firstLineChars="0"/>
+        <w:jc w:val="left"/>
+      </w:pPr>
+      <w:r>
+        <w:rPr>
+          <w:rFonts w:hint="default" w:ascii="Bodoni MT" w:hAnsi="Bodoni MT" w:eastAsia="等线" w:cs="Bodoni MT"/>
+          <w:color w:val="auto"/>
+          <w:kern w:val="0"/>
+          <w:sz w:val="22"/>
+          <w:szCs w:val="22"/>
+          <w:lang w:val="en-US" w:eastAsia="zh-CN" w:bidi="ar"/>
+        </w:rPr>
+        <w:t>now this state will be checked, it should match with the state that was send to google before authentication.</w:t>
+      </w:r>
+    </w:p>
+    <w:p>
+      <w:pPr>
+        <w:keepNext w:val="0"/>
+        <w:keepLines w:val="0"/>
+        <w:widowControl/>
+        <w:numPr>
+          <w:ilvl w:val="1"/>
+          <w:numId w:val="13"/>
+        </w:numPr>
+        <w:suppressLineNumbers w:val="0"/>
+        <w:spacing w:before="0" w:beforeAutospacing="0" w:after="0" w:afterAutospacing="0" w:line="360" w:lineRule="auto"/>
+        <w:ind w:left="840" w:leftChars="0" w:right="0" w:hanging="420" w:firstLineChars="0"/>
+        <w:jc w:val="left"/>
+      </w:pPr>
+      <w:r>
+        <w:rPr>
+          <w:rFonts w:hint="default" w:ascii="Bodoni MT" w:hAnsi="Bodoni MT" w:eastAsia="等线" w:cs="Bodoni MT"/>
+          <w:color w:val="auto"/>
+          <w:kern w:val="0"/>
+          <w:sz w:val="22"/>
+          <w:szCs w:val="22"/>
+          <w:lang w:val="en-US" w:eastAsia="zh-CN" w:bidi="ar"/>
+        </w:rPr>
+        <w:t>if validation are successful, then application backend will use that code and make one POST request to google to get the tokens.</w:t>
+      </w:r>
+    </w:p>
+    <w:p>
+      <w:pPr>
+        <w:keepNext w:val="0"/>
+        <w:keepLines w:val="0"/>
+        <w:widowControl/>
+        <w:numPr>
+          <w:ilvl w:val="0"/>
+          <w:numId w:val="0"/>
+        </w:numPr>
+        <w:suppressLineNumbers w:val="0"/>
+        <w:spacing w:before="0" w:beforeAutospacing="0" w:after="0" w:afterAutospacing="0" w:line="360" w:lineRule="auto"/>
+        <w:ind w:leftChars="0" w:right="0" w:rightChars="0"/>
+        <w:jc w:val="left"/>
+        <w:rPr>
+          <w:rFonts w:hint="default" w:ascii="Bodoni MT" w:hAnsi="Bodoni MT" w:cs="Bodoni MT"/>
+          <w:lang w:val="en-IN"/>
+        </w:rPr>
+      </w:pPr>
     </w:p>
     <w:p>
       <w:pPr>
@@ -8862,59 +9645,880 @@
         <w:keepLines w:val="0"/>
         <w:widowControl/>
         <w:numPr>
-          <w:ilvl w:val="0"/>
           <w:numId w:val="0"/>
         </w:numPr>
         <w:suppressLineNumbers w:val="0"/>
         <w:spacing w:before="0" w:beforeAutospacing="0" w:after="0" w:afterAutospacing="0" w:line="360" w:lineRule="auto"/>
         <w:ind w:leftChars="0" w:right="0" w:rightChars="0"/>
+        <w:jc w:val="center"/>
+        <w:rPr>
+          <w:rFonts w:hint="default" w:ascii="Bodoni MT" w:hAnsi="Bodoni MT" w:eastAsia="等线"/>
+          <w:b/>
+          <w:bCs/>
+          <w:color w:val="002060"/>
+          <w:sz w:val="30"/>
+          <w:szCs w:val="30"/>
+          <w:highlight w:val="lightGray"/>
+          <w:u w:val="single"/>
+          <w:lang w:val="en-US"/>
+        </w:rPr>
+      </w:pPr>
+      <w:r>
+        <w:rPr>
+          <w:rFonts w:hint="default" w:ascii="Bodoni MT" w:hAnsi="Bodoni MT" w:eastAsia="等线"/>
+          <w:b/>
+          <w:bCs/>
+          <w:i/>
+          <w:iCs/>
+          <w:color w:val="002060"/>
+          <w:sz w:val="30"/>
+          <w:szCs w:val="30"/>
+          <w:highlight w:val="lightGray"/>
+          <w:u w:val="single"/>
+          <w:lang w:val="en-US"/>
+        </w:rPr>
+        <w:t xml:space="preserve">  OAuth2</w:t>
+      </w:r>
+      <w:r>
+        <w:rPr>
+          <w:rFonts w:hint="default" w:ascii="Bodoni MT" w:hAnsi="Bodoni MT" w:eastAsia="等线"/>
+          <w:b/>
+          <w:bCs/>
+          <w:color w:val="002060"/>
+          <w:sz w:val="30"/>
+          <w:szCs w:val="30"/>
+          <w:highlight w:val="lightGray"/>
+          <w:u w:val="single"/>
+          <w:lang w:val="en-US"/>
+        </w:rPr>
+        <w:t xml:space="preserve"> in Spring Security</w:t>
+      </w:r>
+      <w:bookmarkStart w:id="0" w:name="_GoBack"/>
+      <w:bookmarkEnd w:id="0"/>
+      <w:r>
+        <w:rPr>
+          <w:rFonts w:hint="default" w:ascii="Bodoni MT" w:hAnsi="Bodoni MT" w:eastAsia="等线"/>
+          <w:b/>
+          <w:bCs/>
+          <w:color w:val="002060"/>
+          <w:sz w:val="30"/>
+          <w:szCs w:val="30"/>
+          <w:highlight w:val="lightGray"/>
+          <w:u w:val="single"/>
+          <w:lang w:val="en-US"/>
+        </w:rPr>
+        <w:t xml:space="preserve"> </w:t>
+      </w:r>
+    </w:p>
+    <w:p>
+      <w:pPr>
+        <w:keepNext w:val="0"/>
+        <w:keepLines w:val="0"/>
+        <w:widowControl/>
+        <w:numPr>
+          <w:ilvl w:val="0"/>
+          <w:numId w:val="14"/>
+        </w:numPr>
+        <w:suppressLineNumbers w:val="0"/>
+        <w:spacing w:before="0" w:beforeAutospacing="0" w:after="0" w:afterAutospacing="0" w:line="360" w:lineRule="auto"/>
+        <w:ind w:left="420" w:leftChars="0" w:right="0" w:hanging="420" w:firstLineChars="0"/>
         <w:jc w:val="left"/>
         <w:rPr>
-          <w:rFonts w:hint="default" w:ascii="Bodoni MT" w:hAnsi="Bodoni MT" w:cs="Bodoni MT"/>
-        </w:rPr>
-      </w:pPr>
-      <w:r>
-        <w:rPr>
-          <w:rFonts w:hint="default" w:ascii="Bodoni MT" w:hAnsi="Bodoni MT" w:cs="Bodoni MT"/>
-          <w:lang w:val="en-IN"/>
-        </w:rPr>
-        <w:drawing>
-          <wp:inline distT="0" distB="0" distL="114300" distR="114300">
-            <wp:extent cx="6558280" cy="9064625"/>
-            <wp:effectExtent l="0" t="0" r="0" b="0"/>
-            <wp:docPr id="14" name="Picture 14" descr="3_explanation_of_flowchart"/>
-            <wp:cNvGraphicFramePr>
-              <a:graphicFrameLocks xmlns:a="http://schemas.openxmlformats.org/drawingml/2006/main" noChangeAspect="1"/>
-            </wp:cNvGraphicFramePr>
-            <a:graphic xmlns:a="http://schemas.openxmlformats.org/drawingml/2006/main">
-              <a:graphicData uri="http://schemas.openxmlformats.org/drawingml/2006/picture">
-                <pic:pic xmlns:pic="http://schemas.openxmlformats.org/drawingml/2006/picture">
-                  <pic:nvPicPr>
-                    <pic:cNvPr id="14" name="Picture 14" descr="3_explanation_of_flowchart"/>
-                    <pic:cNvPicPr>
-                      <a:picLocks noChangeAspect="1"/>
-                    </pic:cNvPicPr>
-                  </pic:nvPicPr>
-                  <pic:blipFill>
-                    <a:blip r:embed="rId34"/>
-                    <a:stretch>
-                      <a:fillRect/>
-                    </a:stretch>
-                  </pic:blipFill>
-                  <pic:spPr>
-                    <a:xfrm>
-                      <a:off x="0" y="0"/>
-                      <a:ext cx="6558280" cy="9064625"/>
-                    </a:xfrm>
-                    <a:prstGeom prst="rect">
-                      <a:avLst/>
-                    </a:prstGeom>
-                  </pic:spPr>
-                </pic:pic>
-              </a:graphicData>
-            </a:graphic>
-          </wp:inline>
-        </w:drawing>
+          <w:rFonts w:hint="default" w:ascii="Bodoni MT" w:hAnsi="Bodoni MT" w:eastAsia="等线"/>
+          <w:b/>
+          <w:bCs/>
+          <w:sz w:val="22"/>
+          <w:szCs w:val="22"/>
+          <w:u w:val="single"/>
+        </w:rPr>
+      </w:pPr>
+      <w:r>
+        <w:rPr>
+          <w:rFonts w:hint="default" w:ascii="Bodoni MT" w:hAnsi="Bodoni MT" w:eastAsia="等线"/>
+          <w:b/>
+          <w:bCs/>
+          <w:sz w:val="22"/>
+          <w:szCs w:val="22"/>
+          <w:u w:val="single"/>
+        </w:rPr>
+        <w:t>Part-1: application backend to oauth2 provider's backend</w:t>
+      </w:r>
+    </w:p>
+    <w:p>
+      <w:pPr>
+        <w:keepNext w:val="0"/>
+        <w:keepLines w:val="0"/>
+        <w:widowControl/>
+        <w:numPr>
+          <w:ilvl w:val="1"/>
+          <w:numId w:val="14"/>
+        </w:numPr>
+        <w:suppressLineNumbers w:val="0"/>
+        <w:spacing w:before="0" w:beforeAutospacing="0" w:after="0" w:afterAutospacing="0" w:line="360" w:lineRule="auto"/>
+        <w:ind w:left="840" w:leftChars="0" w:right="0" w:hanging="420" w:firstLineChars="0"/>
+        <w:jc w:val="left"/>
+        <w:rPr>
+          <w:rFonts w:hint="default" w:ascii="Bodoni MT" w:hAnsi="Bodoni MT" w:eastAsia="等线"/>
+          <w:sz w:val="22"/>
+          <w:szCs w:val="22"/>
+        </w:rPr>
+      </w:pPr>
+      <w:r>
+        <w:rPr>
+          <w:rFonts w:hint="default" w:ascii="Bodoni MT" w:hAnsi="Bodoni MT" w:eastAsia="等线"/>
+          <w:sz w:val="22"/>
+          <w:szCs w:val="22"/>
+        </w:rPr>
+        <w:t xml:space="preserve">First the request come to OAuth2AuthorizationRequestRedirectFilter </w:t>
+      </w:r>
+    </w:p>
+    <w:p>
+      <w:pPr>
+        <w:keepNext w:val="0"/>
+        <w:keepLines w:val="0"/>
+        <w:widowControl/>
+        <w:numPr>
+          <w:ilvl w:val="1"/>
+          <w:numId w:val="14"/>
+        </w:numPr>
+        <w:suppressLineNumbers w:val="0"/>
+        <w:spacing w:before="0" w:beforeAutospacing="0" w:after="0" w:afterAutospacing="0" w:line="360" w:lineRule="auto"/>
+        <w:ind w:left="840" w:leftChars="0" w:right="0" w:hanging="420" w:firstLineChars="0"/>
+        <w:jc w:val="left"/>
+        <w:rPr>
+          <w:rFonts w:hint="default" w:ascii="Bodoni MT" w:hAnsi="Bodoni MT" w:eastAsia="等线"/>
+          <w:sz w:val="22"/>
+          <w:szCs w:val="22"/>
+        </w:rPr>
+      </w:pPr>
+      <w:r>
+        <w:rPr>
+          <w:rFonts w:hint="default" w:ascii="Bodoni MT" w:hAnsi="Bodoni MT" w:eastAsia="等线"/>
+          <w:sz w:val="22"/>
+          <w:szCs w:val="22"/>
+        </w:rPr>
+        <w:t xml:space="preserve">It contains 2 parts: </w:t>
+      </w:r>
+    </w:p>
+    <w:p>
+      <w:pPr>
+        <w:keepNext w:val="0"/>
+        <w:keepLines w:val="0"/>
+        <w:widowControl/>
+        <w:numPr>
+          <w:ilvl w:val="2"/>
+          <w:numId w:val="14"/>
+        </w:numPr>
+        <w:suppressLineNumbers w:val="0"/>
+        <w:spacing w:before="0" w:beforeAutospacing="0" w:after="0" w:afterAutospacing="0" w:line="360" w:lineRule="auto"/>
+        <w:ind w:left="1260" w:leftChars="0" w:right="0" w:hanging="420" w:firstLineChars="0"/>
+        <w:jc w:val="left"/>
+        <w:rPr>
+          <w:rFonts w:hint="default" w:ascii="Bodoni MT" w:hAnsi="Bodoni MT" w:eastAsia="等线"/>
+          <w:sz w:val="22"/>
+          <w:szCs w:val="22"/>
+        </w:rPr>
+      </w:pPr>
+      <w:r>
+        <w:rPr>
+          <w:rFonts w:hint="default" w:ascii="Bodoni MT" w:hAnsi="Bodoni MT" w:eastAsia="等线"/>
+          <w:sz w:val="22"/>
+          <w:szCs w:val="22"/>
+        </w:rPr>
+        <w:t>one part builds the OAuth2AuthorizationRequest object (which is the final object which will be sent to oauth2 provider)</w:t>
+      </w:r>
+    </w:p>
+    <w:p>
+      <w:pPr>
+        <w:keepNext w:val="0"/>
+        <w:keepLines w:val="0"/>
+        <w:widowControl/>
+        <w:numPr>
+          <w:ilvl w:val="2"/>
+          <w:numId w:val="14"/>
+        </w:numPr>
+        <w:suppressLineNumbers w:val="0"/>
+        <w:spacing w:before="0" w:beforeAutospacing="0" w:after="0" w:afterAutospacing="0" w:line="360" w:lineRule="auto"/>
+        <w:ind w:left="1260" w:leftChars="0" w:right="0" w:hanging="420" w:firstLineChars="0"/>
+        <w:jc w:val="left"/>
+        <w:rPr>
+          <w:rFonts w:hint="default" w:ascii="Bodoni MT" w:hAnsi="Bodoni MT" w:eastAsia="等线"/>
+          <w:sz w:val="22"/>
+          <w:szCs w:val="22"/>
+        </w:rPr>
+      </w:pPr>
+      <w:r>
+        <w:rPr>
+          <w:rFonts w:hint="default" w:ascii="Bodoni MT" w:hAnsi="Bodoni MT" w:eastAsia="等线"/>
+          <w:sz w:val="22"/>
+          <w:szCs w:val="22"/>
+        </w:rPr>
+        <w:t>another part will save that object when the control goes to OAuth2 provider.</w:t>
+      </w:r>
+    </w:p>
+    <w:p>
+      <w:pPr>
+        <w:keepNext w:val="0"/>
+        <w:keepLines w:val="0"/>
+        <w:widowControl/>
+        <w:numPr>
+          <w:ilvl w:val="1"/>
+          <w:numId w:val="14"/>
+        </w:numPr>
+        <w:suppressLineNumbers w:val="0"/>
+        <w:spacing w:before="0" w:beforeAutospacing="0" w:after="0" w:afterAutospacing="0" w:line="360" w:lineRule="auto"/>
+        <w:ind w:left="840" w:leftChars="0" w:right="0" w:hanging="420" w:firstLineChars="0"/>
+        <w:jc w:val="left"/>
+        <w:rPr>
+          <w:rFonts w:hint="default" w:ascii="Bodoni MT" w:hAnsi="Bodoni MT" w:eastAsia="等线"/>
+          <w:sz w:val="22"/>
+          <w:szCs w:val="22"/>
+        </w:rPr>
+      </w:pPr>
+      <w:r>
+        <w:rPr>
+          <w:rFonts w:hint="default" w:ascii="Bodoni MT" w:hAnsi="Bodoni MT" w:eastAsia="等线"/>
+          <w:sz w:val="22"/>
+          <w:szCs w:val="22"/>
+        </w:rPr>
+        <w:t>ClientRegistration is a class that contains all the details of the Client i.e. client id, client secret, registrationId, redirectUri etc; but it doesn’t contain the state.</w:t>
+      </w:r>
+    </w:p>
+    <w:p>
+      <w:pPr>
+        <w:keepNext w:val="0"/>
+        <w:keepLines w:val="0"/>
+        <w:widowControl/>
+        <w:numPr>
+          <w:ilvl w:val="2"/>
+          <w:numId w:val="14"/>
+        </w:numPr>
+        <w:suppressLineNumbers w:val="0"/>
+        <w:spacing w:before="0" w:beforeAutospacing="0" w:after="0" w:afterAutospacing="0" w:line="360" w:lineRule="auto"/>
+        <w:ind w:left="1260" w:leftChars="0" w:right="0" w:hanging="420" w:firstLineChars="0"/>
+        <w:jc w:val="left"/>
+        <w:rPr>
+          <w:rFonts w:hint="default" w:ascii="Bodoni MT" w:hAnsi="Bodoni MT" w:eastAsia="等线"/>
+          <w:sz w:val="22"/>
+          <w:szCs w:val="22"/>
+        </w:rPr>
+      </w:pPr>
+      <w:r>
+        <w:rPr>
+          <w:rFonts w:hint="default" w:ascii="Bodoni MT" w:hAnsi="Bodoni MT" w:eastAsia="等线"/>
+          <w:sz w:val="22"/>
+          <w:szCs w:val="22"/>
+        </w:rPr>
+        <w:t>here redirectUri is in the form: ”{baseUrl}/login/oauth2/code/{registrationId}”</w:t>
+      </w:r>
+    </w:p>
+    <w:p>
+      <w:pPr>
+        <w:keepNext w:val="0"/>
+        <w:keepLines w:val="0"/>
+        <w:widowControl/>
+        <w:numPr>
+          <w:ilvl w:val="1"/>
+          <w:numId w:val="14"/>
+        </w:numPr>
+        <w:suppressLineNumbers w:val="0"/>
+        <w:spacing w:before="0" w:beforeAutospacing="0" w:after="0" w:afterAutospacing="0" w:line="360" w:lineRule="auto"/>
+        <w:ind w:left="840" w:leftChars="0" w:right="0" w:hanging="420" w:firstLineChars="0"/>
+        <w:jc w:val="left"/>
+        <w:rPr>
+          <w:rFonts w:hint="default" w:ascii="Bodoni MT" w:hAnsi="Bodoni MT" w:eastAsia="等线"/>
+          <w:sz w:val="22"/>
+          <w:szCs w:val="22"/>
+        </w:rPr>
+      </w:pPr>
+      <w:r>
+        <w:rPr>
+          <w:rFonts w:hint="default" w:ascii="Bodoni MT" w:hAnsi="Bodoni MT" w:eastAsia="等线"/>
+          <w:sz w:val="22"/>
+          <w:szCs w:val="22"/>
+        </w:rPr>
+        <w:t>There is a repository that stores all the ClientRegistration objects, which is ClientRegistrationRepository.</w:t>
+      </w:r>
+    </w:p>
+    <w:p>
+      <w:pPr>
+        <w:keepNext w:val="0"/>
+        <w:keepLines w:val="0"/>
+        <w:widowControl/>
+        <w:numPr>
+          <w:ilvl w:val="2"/>
+          <w:numId w:val="14"/>
+        </w:numPr>
+        <w:suppressLineNumbers w:val="0"/>
+        <w:spacing w:before="0" w:beforeAutospacing="0" w:after="0" w:afterAutospacing="0" w:line="360" w:lineRule="auto"/>
+        <w:ind w:left="1260" w:leftChars="0" w:right="0" w:hanging="420" w:firstLineChars="0"/>
+        <w:jc w:val="left"/>
+        <w:rPr>
+          <w:rFonts w:hint="default" w:ascii="Bodoni MT" w:hAnsi="Bodoni MT" w:eastAsia="等线"/>
+          <w:sz w:val="22"/>
+          <w:szCs w:val="22"/>
+        </w:rPr>
+      </w:pPr>
+      <w:r>
+        <w:rPr>
+          <w:rFonts w:hint="default" w:ascii="Bodoni MT" w:hAnsi="Bodoni MT" w:eastAsia="等线"/>
+          <w:sz w:val="22"/>
+          <w:szCs w:val="22"/>
+        </w:rPr>
+        <w:t>It contains a method findByRegistrationId which gives the ClientRegistration object for the particular registrationId (registrationId is nothing but “google”, “facebook”, “github”)</w:t>
+      </w:r>
+    </w:p>
+    <w:p>
+      <w:pPr>
+        <w:keepNext w:val="0"/>
+        <w:keepLines w:val="0"/>
+        <w:widowControl/>
+        <w:numPr>
+          <w:ilvl w:val="1"/>
+          <w:numId w:val="14"/>
+        </w:numPr>
+        <w:suppressLineNumbers w:val="0"/>
+        <w:spacing w:before="0" w:beforeAutospacing="0" w:after="0" w:afterAutospacing="0" w:line="360" w:lineRule="auto"/>
+        <w:ind w:left="840" w:leftChars="0" w:right="0" w:hanging="420" w:firstLineChars="0"/>
+        <w:jc w:val="left"/>
+        <w:rPr>
+          <w:rFonts w:hint="default" w:ascii="Bodoni MT" w:hAnsi="Bodoni MT" w:eastAsia="等线"/>
+          <w:sz w:val="22"/>
+          <w:szCs w:val="22"/>
+        </w:rPr>
+      </w:pPr>
+      <w:r>
+        <w:rPr>
+          <w:rFonts w:hint="default" w:ascii="Bodoni MT" w:hAnsi="Bodoni MT" w:eastAsia="等线"/>
+          <w:sz w:val="22"/>
+          <w:szCs w:val="22"/>
+        </w:rPr>
+        <w:t>So, now we have all the objects os ClientRegistration, but we need to make the object proper to send in the request to OAuth2 provider.</w:t>
+      </w:r>
+    </w:p>
+    <w:p>
+      <w:pPr>
+        <w:keepNext w:val="0"/>
+        <w:keepLines w:val="0"/>
+        <w:widowControl/>
+        <w:numPr>
+          <w:ilvl w:val="2"/>
+          <w:numId w:val="14"/>
+        </w:numPr>
+        <w:suppressLineNumbers w:val="0"/>
+        <w:spacing w:before="0" w:beforeAutospacing="0" w:after="0" w:afterAutospacing="0" w:line="360" w:lineRule="auto"/>
+        <w:ind w:left="1260" w:leftChars="0" w:right="0" w:hanging="420" w:firstLineChars="0"/>
+        <w:jc w:val="left"/>
+        <w:rPr>
+          <w:rFonts w:hint="default" w:ascii="Bodoni MT" w:hAnsi="Bodoni MT" w:eastAsia="等线"/>
+          <w:sz w:val="22"/>
+          <w:szCs w:val="22"/>
+        </w:rPr>
+      </w:pPr>
+      <w:r>
+        <w:rPr>
+          <w:rFonts w:hint="default" w:ascii="Bodoni MT" w:hAnsi="Bodoni MT" w:eastAsia="等线"/>
+          <w:sz w:val="22"/>
+          <w:szCs w:val="22"/>
+        </w:rPr>
+        <w:t>because it has only templates kind of things. like you can see redirectUri is just a template, there is no state present here.</w:t>
+      </w:r>
+    </w:p>
+    <w:p>
+      <w:pPr>
+        <w:keepNext w:val="0"/>
+        <w:keepLines w:val="0"/>
+        <w:widowControl/>
+        <w:numPr>
+          <w:ilvl w:val="2"/>
+          <w:numId w:val="14"/>
+        </w:numPr>
+        <w:suppressLineNumbers w:val="0"/>
+        <w:spacing w:before="0" w:beforeAutospacing="0" w:after="0" w:afterAutospacing="0" w:line="360" w:lineRule="auto"/>
+        <w:ind w:left="1260" w:leftChars="0" w:right="0" w:hanging="420" w:firstLineChars="0"/>
+        <w:jc w:val="left"/>
+        <w:rPr>
+          <w:rFonts w:hint="default" w:ascii="Bodoni MT" w:hAnsi="Bodoni MT" w:eastAsia="等线"/>
+          <w:sz w:val="22"/>
+          <w:szCs w:val="22"/>
+        </w:rPr>
+      </w:pPr>
+      <w:r>
+        <w:rPr>
+          <w:rFonts w:hint="default" w:ascii="Bodoni MT" w:hAnsi="Bodoni MT" w:eastAsia="等线"/>
+          <w:sz w:val="22"/>
+          <w:szCs w:val="22"/>
+        </w:rPr>
+        <w:t>So, there is a resolver class which is named as DefaultOAuth2AuthorizatoinRequestResolver which takes the ClientRegistration object and create a OAuth2AuthorizationRequest object which contains fully ready values that can be sent to OAuth2 provider directly.</w:t>
+      </w:r>
+    </w:p>
+    <w:p>
+      <w:pPr>
+        <w:keepNext w:val="0"/>
+        <w:keepLines w:val="0"/>
+        <w:widowControl/>
+        <w:numPr>
+          <w:ilvl w:val="2"/>
+          <w:numId w:val="14"/>
+        </w:numPr>
+        <w:suppressLineNumbers w:val="0"/>
+        <w:spacing w:before="0" w:beforeAutospacing="0" w:after="0" w:afterAutospacing="0" w:line="360" w:lineRule="auto"/>
+        <w:ind w:left="1260" w:leftChars="0" w:right="0" w:hanging="420" w:firstLineChars="0"/>
+        <w:jc w:val="left"/>
+        <w:rPr>
+          <w:rFonts w:hint="default" w:ascii="Bodoni MT" w:hAnsi="Bodoni MT" w:eastAsia="等线"/>
+          <w:sz w:val="22"/>
+          <w:szCs w:val="22"/>
+        </w:rPr>
+      </w:pPr>
+      <w:r>
+        <w:rPr>
+          <w:rFonts w:hint="default" w:ascii="Bodoni MT" w:hAnsi="Bodoni MT" w:eastAsia="等线"/>
+          <w:sz w:val="22"/>
+          <w:szCs w:val="22"/>
+        </w:rPr>
+        <w:t>here state will be present.</w:t>
+      </w:r>
+    </w:p>
+    <w:p>
+      <w:pPr>
+        <w:keepNext w:val="0"/>
+        <w:keepLines w:val="0"/>
+        <w:widowControl/>
+        <w:numPr>
+          <w:ilvl w:val="2"/>
+          <w:numId w:val="14"/>
+        </w:numPr>
+        <w:suppressLineNumbers w:val="0"/>
+        <w:spacing w:before="0" w:beforeAutospacing="0" w:after="0" w:afterAutospacing="0" w:line="360" w:lineRule="auto"/>
+        <w:ind w:left="1260" w:leftChars="0" w:right="0" w:hanging="420" w:firstLineChars="0"/>
+        <w:jc w:val="left"/>
+        <w:rPr>
+          <w:rFonts w:hint="default" w:ascii="Bodoni MT" w:hAnsi="Bodoni MT" w:eastAsia="等线"/>
+          <w:sz w:val="22"/>
+          <w:szCs w:val="22"/>
+        </w:rPr>
+      </w:pPr>
+      <w:r>
+        <w:rPr>
+          <w:rFonts w:hint="default" w:ascii="Bodoni MT" w:hAnsi="Bodoni MT" w:eastAsia="等线"/>
+          <w:sz w:val="22"/>
+          <w:szCs w:val="22"/>
+        </w:rPr>
+        <w:t>here the redirectUri will be in the form of: "http://localhost:8080/login/oauth2/code/google"</w:t>
+      </w:r>
+    </w:p>
+    <w:p>
+      <w:pPr>
+        <w:keepNext w:val="0"/>
+        <w:keepLines w:val="0"/>
+        <w:widowControl/>
+        <w:numPr>
+          <w:ilvl w:val="1"/>
+          <w:numId w:val="14"/>
+        </w:numPr>
+        <w:suppressLineNumbers w:val="0"/>
+        <w:spacing w:before="0" w:beforeAutospacing="0" w:after="0" w:afterAutospacing="0" w:line="360" w:lineRule="auto"/>
+        <w:ind w:left="840" w:leftChars="0" w:right="0" w:hanging="420" w:firstLineChars="0"/>
+        <w:jc w:val="left"/>
+        <w:rPr>
+          <w:rFonts w:hint="default" w:ascii="Bodoni MT" w:hAnsi="Bodoni MT" w:eastAsia="等线"/>
+          <w:sz w:val="22"/>
+          <w:szCs w:val="22"/>
+        </w:rPr>
+      </w:pPr>
+      <w:r>
+        <w:rPr>
+          <w:rFonts w:hint="default" w:ascii="Bodoni MT" w:hAnsi="Bodoni MT" w:eastAsia="等线"/>
+          <w:sz w:val="22"/>
+          <w:szCs w:val="22"/>
+        </w:rPr>
+        <w:t>Now, everything is completed, just the request has to be sent to OAuth2 provider; but we need to keep the object somewhere to validate after getting the response from OAuth2 provider.</w:t>
+      </w:r>
+    </w:p>
+    <w:p>
+      <w:pPr>
+        <w:keepNext w:val="0"/>
+        <w:keepLines w:val="0"/>
+        <w:widowControl/>
+        <w:numPr>
+          <w:ilvl w:val="2"/>
+          <w:numId w:val="14"/>
+        </w:numPr>
+        <w:suppressLineNumbers w:val="0"/>
+        <w:spacing w:before="0" w:beforeAutospacing="0" w:after="0" w:afterAutospacing="0" w:line="360" w:lineRule="auto"/>
+        <w:ind w:left="1260" w:leftChars="0" w:right="0" w:hanging="420" w:firstLineChars="0"/>
+        <w:jc w:val="left"/>
+        <w:rPr>
+          <w:rFonts w:hint="default" w:ascii="Bodoni MT" w:hAnsi="Bodoni MT" w:eastAsia="等线"/>
+          <w:sz w:val="22"/>
+          <w:szCs w:val="22"/>
+        </w:rPr>
+      </w:pPr>
+      <w:r>
+        <w:rPr>
+          <w:rFonts w:hint="default" w:ascii="Bodoni MT" w:hAnsi="Bodoni MT" w:eastAsia="等线"/>
+          <w:sz w:val="22"/>
+          <w:szCs w:val="22"/>
+        </w:rPr>
+        <w:t>So, there is a repository AuthorizationRequestRepository is there to store the OAuth2AuthorizationRequest object.</w:t>
+      </w:r>
+    </w:p>
+    <w:p>
+      <w:pPr>
+        <w:keepNext w:val="0"/>
+        <w:keepLines w:val="0"/>
+        <w:widowControl/>
+        <w:numPr>
+          <w:ilvl w:val="2"/>
+          <w:numId w:val="14"/>
+        </w:numPr>
+        <w:suppressLineNumbers w:val="0"/>
+        <w:spacing w:before="0" w:beforeAutospacing="0" w:after="0" w:afterAutospacing="0" w:line="360" w:lineRule="auto"/>
+        <w:ind w:left="1260" w:leftChars="0" w:right="0" w:hanging="420" w:firstLineChars="0"/>
+        <w:jc w:val="left"/>
+        <w:rPr>
+          <w:rFonts w:hint="default" w:ascii="Bodoni MT" w:hAnsi="Bodoni MT" w:eastAsia="等线"/>
+          <w:sz w:val="22"/>
+          <w:szCs w:val="22"/>
+        </w:rPr>
+      </w:pPr>
+      <w:r>
+        <w:rPr>
+          <w:rFonts w:hint="default" w:ascii="Bodoni MT" w:hAnsi="Bodoni MT" w:eastAsia="等线"/>
+          <w:sz w:val="22"/>
+          <w:szCs w:val="22"/>
+        </w:rPr>
+        <w:t>it doesn’t store those objects in any list or map, it just creates one attribute in the request object and store there.</w:t>
+      </w:r>
+    </w:p>
+    <w:p>
+      <w:pPr>
+        <w:keepNext w:val="0"/>
+        <w:keepLines w:val="0"/>
+        <w:widowControl/>
+        <w:numPr>
+          <w:ilvl w:val="0"/>
+          <w:numId w:val="14"/>
+        </w:numPr>
+        <w:suppressLineNumbers w:val="0"/>
+        <w:spacing w:before="0" w:beforeAutospacing="0" w:after="0" w:afterAutospacing="0" w:line="360" w:lineRule="auto"/>
+        <w:ind w:left="420" w:leftChars="0" w:right="0" w:hanging="420" w:firstLineChars="0"/>
+        <w:jc w:val="left"/>
+        <w:rPr>
+          <w:rFonts w:hint="default" w:ascii="Bodoni MT" w:hAnsi="Bodoni MT" w:eastAsia="等线"/>
+          <w:b/>
+          <w:bCs/>
+          <w:sz w:val="22"/>
+          <w:szCs w:val="22"/>
+          <w:u w:val="single"/>
+        </w:rPr>
+      </w:pPr>
+      <w:r>
+        <w:rPr>
+          <w:rFonts w:hint="default" w:ascii="Bodoni MT" w:hAnsi="Bodoni MT" w:eastAsia="等线"/>
+          <w:b/>
+          <w:bCs/>
+          <w:sz w:val="22"/>
+          <w:szCs w:val="22"/>
+          <w:u w:val="single"/>
+        </w:rPr>
+        <w:t>Part-2: oauth2 provider to application’s backend</w:t>
+      </w:r>
+    </w:p>
+    <w:p>
+      <w:pPr>
+        <w:keepNext w:val="0"/>
+        <w:keepLines w:val="0"/>
+        <w:widowControl/>
+        <w:numPr>
+          <w:ilvl w:val="1"/>
+          <w:numId w:val="14"/>
+        </w:numPr>
+        <w:suppressLineNumbers w:val="0"/>
+        <w:spacing w:before="0" w:beforeAutospacing="0" w:after="0" w:afterAutospacing="0" w:line="360" w:lineRule="auto"/>
+        <w:ind w:left="840" w:leftChars="0" w:right="0" w:hanging="420" w:firstLineChars="0"/>
+        <w:jc w:val="left"/>
+        <w:rPr>
+          <w:rFonts w:hint="default" w:ascii="Bodoni MT" w:hAnsi="Bodoni MT" w:eastAsia="等线"/>
+          <w:sz w:val="22"/>
+          <w:szCs w:val="22"/>
+        </w:rPr>
+      </w:pPr>
+      <w:r>
+        <w:rPr>
+          <w:rFonts w:hint="default" w:ascii="Bodoni MT" w:hAnsi="Bodoni MT" w:eastAsia="等线"/>
+          <w:sz w:val="22"/>
+          <w:szCs w:val="22"/>
+        </w:rPr>
+        <w:t>OAuth2LoginAuthenticationFilter is the first filter in this case.</w:t>
+      </w:r>
+    </w:p>
+    <w:p>
+      <w:pPr>
+        <w:keepNext w:val="0"/>
+        <w:keepLines w:val="0"/>
+        <w:widowControl/>
+        <w:numPr>
+          <w:ilvl w:val="1"/>
+          <w:numId w:val="14"/>
+        </w:numPr>
+        <w:suppressLineNumbers w:val="0"/>
+        <w:spacing w:before="0" w:beforeAutospacing="0" w:after="0" w:afterAutospacing="0" w:line="360" w:lineRule="auto"/>
+        <w:ind w:left="840" w:leftChars="0" w:right="0" w:hanging="420" w:firstLineChars="0"/>
+        <w:jc w:val="left"/>
+        <w:rPr>
+          <w:rFonts w:hint="default" w:ascii="Bodoni MT" w:hAnsi="Bodoni MT" w:eastAsia="等线"/>
+          <w:sz w:val="22"/>
+          <w:szCs w:val="22"/>
+        </w:rPr>
+      </w:pPr>
+      <w:r>
+        <w:rPr>
+          <w:rFonts w:hint="default" w:ascii="Bodoni MT" w:hAnsi="Bodoni MT" w:eastAsia="等线"/>
+          <w:sz w:val="22"/>
+          <w:szCs w:val="22"/>
+        </w:rPr>
+        <w:t>it gets the OAuth2AuthorizationObject from the AuthorizationRequestRepository .</w:t>
+      </w:r>
+    </w:p>
+    <w:p>
+      <w:pPr>
+        <w:keepNext w:val="0"/>
+        <w:keepLines w:val="0"/>
+        <w:widowControl/>
+        <w:numPr>
+          <w:ilvl w:val="1"/>
+          <w:numId w:val="14"/>
+        </w:numPr>
+        <w:suppressLineNumbers w:val="0"/>
+        <w:spacing w:before="0" w:beforeAutospacing="0" w:after="0" w:afterAutospacing="0" w:line="360" w:lineRule="auto"/>
+        <w:ind w:left="840" w:leftChars="0" w:right="0" w:hanging="420" w:firstLineChars="0"/>
+        <w:jc w:val="left"/>
+        <w:rPr>
+          <w:rFonts w:hint="default" w:ascii="Bodoni MT" w:hAnsi="Bodoni MT" w:eastAsia="等线"/>
+          <w:sz w:val="22"/>
+          <w:szCs w:val="22"/>
+        </w:rPr>
+      </w:pPr>
+      <w:r>
+        <w:rPr>
+          <w:rFonts w:hint="default" w:ascii="Bodoni MT" w:hAnsi="Bodoni MT" w:eastAsia="等线"/>
+          <w:sz w:val="22"/>
+          <w:szCs w:val="22"/>
+        </w:rPr>
+        <w:t>then it validate the details from the response of OAuth2 provider with the OAuth2AuthorizationObject, for example state will be checked.</w:t>
+      </w:r>
+    </w:p>
+    <w:p>
+      <w:pPr>
+        <w:keepNext w:val="0"/>
+        <w:keepLines w:val="0"/>
+        <w:widowControl/>
+        <w:numPr>
+          <w:ilvl w:val="1"/>
+          <w:numId w:val="14"/>
+        </w:numPr>
+        <w:suppressLineNumbers w:val="0"/>
+        <w:spacing w:before="0" w:beforeAutospacing="0" w:after="0" w:afterAutospacing="0" w:line="360" w:lineRule="auto"/>
+        <w:ind w:left="840" w:leftChars="0" w:right="0" w:hanging="420" w:firstLineChars="0"/>
+        <w:jc w:val="left"/>
+        <w:rPr>
+          <w:rFonts w:hint="default" w:ascii="Bodoni MT" w:hAnsi="Bodoni MT" w:eastAsia="等线"/>
+          <w:sz w:val="22"/>
+          <w:szCs w:val="22"/>
+        </w:rPr>
+      </w:pPr>
+      <w:r>
+        <w:rPr>
+          <w:rFonts w:hint="default" w:ascii="Bodoni MT" w:hAnsi="Bodoni MT" w:eastAsia="等线"/>
+          <w:sz w:val="22"/>
+          <w:szCs w:val="22"/>
+        </w:rPr>
+        <w:t>if any mismatch is there, then it’ll reject it.</w:t>
+      </w:r>
+    </w:p>
+    <w:p>
+      <w:pPr>
+        <w:keepNext w:val="0"/>
+        <w:keepLines w:val="0"/>
+        <w:widowControl/>
+        <w:numPr>
+          <w:ilvl w:val="1"/>
+          <w:numId w:val="14"/>
+        </w:numPr>
+        <w:suppressLineNumbers w:val="0"/>
+        <w:spacing w:before="0" w:beforeAutospacing="0" w:after="0" w:afterAutospacing="0" w:line="360" w:lineRule="auto"/>
+        <w:ind w:left="840" w:leftChars="0" w:right="0" w:hanging="420" w:firstLineChars="0"/>
+        <w:jc w:val="left"/>
+        <w:rPr>
+          <w:rFonts w:hint="default" w:ascii="Bodoni MT" w:hAnsi="Bodoni MT" w:eastAsia="等线"/>
+          <w:sz w:val="22"/>
+          <w:szCs w:val="22"/>
+        </w:rPr>
+      </w:pPr>
+      <w:r>
+        <w:rPr>
+          <w:rFonts w:hint="default" w:ascii="Bodoni MT" w:hAnsi="Bodoni MT" w:eastAsia="等线"/>
+          <w:sz w:val="22"/>
+          <w:szCs w:val="22"/>
+        </w:rPr>
+        <w:t>after that it’ll simply call the authenticate() method of authenticationManager, just like we do in case of username and password authentication.</w:t>
+      </w:r>
+    </w:p>
+    <w:p>
+      <w:pPr>
+        <w:keepNext w:val="0"/>
+        <w:keepLines w:val="0"/>
+        <w:widowControl/>
+        <w:numPr>
+          <w:ilvl w:val="2"/>
+          <w:numId w:val="14"/>
+        </w:numPr>
+        <w:suppressLineNumbers w:val="0"/>
+        <w:spacing w:before="0" w:beforeAutospacing="0" w:after="0" w:afterAutospacing="0" w:line="360" w:lineRule="auto"/>
+        <w:ind w:left="1260" w:leftChars="0" w:right="0" w:hanging="420" w:firstLineChars="0"/>
+        <w:jc w:val="left"/>
+        <w:rPr>
+          <w:rFonts w:hint="default" w:ascii="Bodoni MT" w:hAnsi="Bodoni MT" w:eastAsia="等线"/>
+          <w:sz w:val="22"/>
+          <w:szCs w:val="22"/>
+        </w:rPr>
+      </w:pPr>
+      <w:r>
+        <w:rPr>
+          <w:rFonts w:hint="default" w:ascii="Bodoni MT" w:hAnsi="Bodoni MT" w:eastAsia="等线"/>
+          <w:sz w:val="22"/>
+          <w:szCs w:val="22"/>
+        </w:rPr>
+        <w:t>here the authentication token will be of type: OAuth2LoginAuthenticationToken</w:t>
+      </w:r>
+    </w:p>
+    <w:p>
+      <w:pPr>
+        <w:keepNext w:val="0"/>
+        <w:keepLines w:val="0"/>
+        <w:widowControl/>
+        <w:numPr>
+          <w:ilvl w:val="1"/>
+          <w:numId w:val="14"/>
+        </w:numPr>
+        <w:suppressLineNumbers w:val="0"/>
+        <w:spacing w:before="0" w:beforeAutospacing="0" w:after="0" w:afterAutospacing="0" w:line="360" w:lineRule="auto"/>
+        <w:ind w:left="840" w:leftChars="0" w:right="0" w:hanging="420" w:firstLineChars="0"/>
+        <w:jc w:val="left"/>
+        <w:rPr>
+          <w:rFonts w:hint="default" w:ascii="Bodoni MT" w:hAnsi="Bodoni MT" w:eastAsia="等线"/>
+          <w:sz w:val="22"/>
+          <w:szCs w:val="22"/>
+        </w:rPr>
+      </w:pPr>
+      <w:r>
+        <w:rPr>
+          <w:rFonts w:hint="default" w:ascii="Bodoni MT" w:hAnsi="Bodoni MT" w:eastAsia="等线"/>
+          <w:sz w:val="22"/>
+          <w:szCs w:val="22"/>
+        </w:rPr>
+        <w:t>then this authentication() method call will be delegated to AuthenticationProvider’s authenticaion() method and in case of OAuth2, the AuthenticationProvider is OAuth2LoginAuthenticationProvider.</w:t>
+      </w:r>
+    </w:p>
+    <w:p>
+      <w:pPr>
+        <w:keepNext w:val="0"/>
+        <w:keepLines w:val="0"/>
+        <w:widowControl/>
+        <w:numPr>
+          <w:ilvl w:val="1"/>
+          <w:numId w:val="14"/>
+        </w:numPr>
+        <w:suppressLineNumbers w:val="0"/>
+        <w:spacing w:before="0" w:beforeAutospacing="0" w:after="0" w:afterAutospacing="0" w:line="360" w:lineRule="auto"/>
+        <w:ind w:left="840" w:leftChars="0" w:right="0" w:hanging="420" w:firstLineChars="0"/>
+        <w:jc w:val="left"/>
+        <w:rPr>
+          <w:rFonts w:hint="default" w:ascii="Bodoni MT" w:hAnsi="Bodoni MT" w:eastAsia="等线"/>
+          <w:sz w:val="22"/>
+          <w:szCs w:val="22"/>
+        </w:rPr>
+      </w:pPr>
+      <w:r>
+        <w:rPr>
+          <w:rFonts w:hint="default" w:ascii="Bodoni MT" w:hAnsi="Bodoni MT" w:eastAsia="等线"/>
+          <w:sz w:val="22"/>
+          <w:szCs w:val="22"/>
+        </w:rPr>
+        <w:t>this OAuth2LoginAuthenticationProvider exchange the code that was gotten from OAuth2 provider’s response and get the tokens like id_token, accessToken etc etc.</w:t>
+      </w:r>
+    </w:p>
+    <w:p>
+      <w:pPr>
+        <w:keepNext w:val="0"/>
+        <w:keepLines w:val="0"/>
+        <w:widowControl/>
+        <w:numPr>
+          <w:ilvl w:val="1"/>
+          <w:numId w:val="14"/>
+        </w:numPr>
+        <w:suppressLineNumbers w:val="0"/>
+        <w:spacing w:before="0" w:beforeAutospacing="0" w:after="0" w:afterAutospacing="0" w:line="360" w:lineRule="auto"/>
+        <w:ind w:left="840" w:leftChars="0" w:right="0" w:hanging="420" w:firstLineChars="0"/>
+        <w:jc w:val="left"/>
+        <w:rPr>
+          <w:rFonts w:hint="default" w:ascii="Bodoni MT" w:hAnsi="Bodoni MT" w:eastAsia="等线"/>
+          <w:sz w:val="22"/>
+          <w:szCs w:val="22"/>
+        </w:rPr>
+      </w:pPr>
+      <w:r>
+        <w:rPr>
+          <w:rFonts w:hint="default" w:ascii="Bodoni MT" w:hAnsi="Bodoni MT" w:eastAsia="等线"/>
+          <w:sz w:val="22"/>
+          <w:szCs w:val="22"/>
+        </w:rPr>
+        <w:t>this id_token contains the necessary details about the user that we want like username, email etc etc.</w:t>
+      </w:r>
+    </w:p>
+    <w:p>
+      <w:pPr>
+        <w:keepNext w:val="0"/>
+        <w:keepLines w:val="0"/>
+        <w:widowControl/>
+        <w:numPr>
+          <w:ilvl w:val="1"/>
+          <w:numId w:val="14"/>
+        </w:numPr>
+        <w:suppressLineNumbers w:val="0"/>
+        <w:spacing w:before="0" w:beforeAutospacing="0" w:after="0" w:afterAutospacing="0" w:line="360" w:lineRule="auto"/>
+        <w:ind w:left="840" w:leftChars="0" w:right="0" w:hanging="420" w:firstLineChars="0"/>
+        <w:jc w:val="left"/>
+        <w:rPr>
+          <w:rFonts w:hint="default" w:ascii="Bodoni MT" w:hAnsi="Bodoni MT" w:eastAsia="等线" w:cs="Bodoni MT"/>
+          <w:sz w:val="22"/>
+          <w:szCs w:val="22"/>
+        </w:rPr>
+      </w:pPr>
+      <w:r>
+        <w:rPr>
+          <w:rFonts w:hint="default" w:ascii="Bodoni MT" w:hAnsi="Bodoni MT" w:eastAsia="等线"/>
+          <w:sz w:val="22"/>
+          <w:szCs w:val="22"/>
+        </w:rPr>
+        <w:t>after that it just store the authentication object in security context and we can get the details using getPrincipal() method just like username and password authentication.</w:t>
+      </w:r>
+    </w:p>
+    <w:p>
+      <w:pPr>
+        <w:rPr>
+          <w:rFonts w:hint="default" w:ascii="Bodoni MT" w:hAnsi="Bodoni MT" w:cs="Bodoni MT"/>
+          <w:lang w:val="en-IN"/>
+        </w:rPr>
+      </w:pPr>
+      <w:r>
+        <w:rPr>
+          <w:rFonts w:hint="default" w:ascii="Bodoni MT" w:hAnsi="Bodoni MT" w:cs="Bodoni MT"/>
+          <w:lang w:val="en-IN"/>
+        </w:rPr>
+        <w:br w:type="page"/>
       </w:r>
     </w:p>
     <w:p>
@@ -9234,7 +10838,7 @@
                     </pic:cNvPicPr>
                   </pic:nvPicPr>
                   <pic:blipFill>
-                    <a:blip r:embed="rId35"/>
+                    <a:blip r:embed="rId34"/>
                     <a:stretch>
                       <a:fillRect/>
                     </a:stretch>
@@ -9338,7 +10942,7 @@
                     </pic:cNvPicPr>
                   </pic:nvPicPr>
                   <pic:blipFill>
-                    <a:blip r:embed="rId36"/>
+                    <a:blip r:embed="rId35"/>
                     <a:stretch>
                       <a:fillRect/>
                     </a:stretch>
@@ -9716,7 +11320,7 @@
                     </pic:cNvPicPr>
                   </pic:nvPicPr>
                   <pic:blipFill>
-                    <a:blip r:embed="rId37"/>
+                    <a:blip r:embed="rId36"/>
                     <a:stretch>
                       <a:fillRect/>
                     </a:stretch>
@@ -9820,7 +11424,7 @@
                     </pic:cNvPicPr>
                   </pic:nvPicPr>
                   <pic:blipFill>
-                    <a:blip r:embed="rId38"/>
+                    <a:blip r:embed="rId37"/>
                     <a:stretch>
                       <a:fillRect/>
                     </a:stretch>
@@ -10086,7 +11690,7 @@
                     </pic:cNvPicPr>
                   </pic:nvPicPr>
                   <pic:blipFill>
-                    <a:blip r:embed="rId39"/>
+                    <a:blip r:embed="rId38"/>
                     <a:stretch>
                       <a:fillRect/>
                     </a:stretch>
@@ -10172,7 +11776,7 @@
                     </pic:cNvPicPr>
                   </pic:nvPicPr>
                   <pic:blipFill>
-                    <a:blip r:embed="rId40"/>
+                    <a:blip r:embed="rId39"/>
                     <a:stretch>
                       <a:fillRect/>
                     </a:stretch>
@@ -10247,7 +11851,7 @@
         <w:widowControl/>
         <w:numPr>
           <w:ilvl w:val="0"/>
-          <w:numId w:val="14"/>
+          <w:numId w:val="15"/>
         </w:numPr>
         <w:suppressLineNumbers w:val="0"/>
         <w:spacing w:before="0" w:beforeAutospacing="0" w:after="0" w:afterAutospacing="0" w:line="360" w:lineRule="auto"/>
@@ -10286,7 +11890,7 @@
         <w:widowControl/>
         <w:numPr>
           <w:ilvl w:val="1"/>
-          <w:numId w:val="14"/>
+          <w:numId w:val="15"/>
         </w:numPr>
         <w:suppressLineNumbers w:val="0"/>
         <w:spacing w:before="0" w:beforeAutospacing="0" w:after="0" w:afterAutospacing="0" w:line="360" w:lineRule="auto"/>
@@ -10332,7 +11936,7 @@
         <w:widowControl/>
         <w:numPr>
           <w:ilvl w:val="1"/>
-          <w:numId w:val="14"/>
+          <w:numId w:val="15"/>
         </w:numPr>
         <w:suppressLineNumbers w:val="0"/>
         <w:spacing w:before="0" w:beforeAutospacing="0" w:after="0" w:afterAutospacing="0" w:line="360" w:lineRule="auto"/>
@@ -10404,7 +12008,7 @@
         <w:widowControl/>
         <w:numPr>
           <w:ilvl w:val="2"/>
-          <w:numId w:val="14"/>
+          <w:numId w:val="15"/>
         </w:numPr>
         <w:suppressLineNumbers w:val="0"/>
         <w:spacing w:before="0" w:beforeAutospacing="0" w:after="0" w:afterAutospacing="0" w:line="360" w:lineRule="auto"/>
@@ -10443,7 +12047,7 @@
                     </pic:cNvPicPr>
                   </pic:nvPicPr>
                   <pic:blipFill>
-                    <a:blip r:embed="rId41"/>
+                    <a:blip r:embed="rId40"/>
                     <a:stretch>
                       <a:fillRect/>
                     </a:stretch>
@@ -10475,7 +12079,7 @@
         <w:widowControl/>
         <w:numPr>
           <w:ilvl w:val="1"/>
-          <w:numId w:val="14"/>
+          <w:numId w:val="15"/>
         </w:numPr>
         <w:suppressLineNumbers w:val="0"/>
         <w:spacing w:before="0" w:beforeAutospacing="0" w:after="0" w:afterAutospacing="0" w:line="360" w:lineRule="auto"/>
@@ -10586,7 +12190,7 @@
         <w:widowControl/>
         <w:numPr>
           <w:ilvl w:val="2"/>
-          <w:numId w:val="14"/>
+          <w:numId w:val="15"/>
         </w:numPr>
         <w:suppressLineNumbers w:val="0"/>
         <w:spacing w:before="0" w:beforeAutospacing="0" w:after="0" w:afterAutospacing="0" w:line="360" w:lineRule="auto"/>
@@ -10625,7 +12229,7 @@
                     </pic:cNvPicPr>
                   </pic:nvPicPr>
                   <pic:blipFill>
-                    <a:blip r:embed="rId42"/>
+                    <a:blip r:embed="rId41"/>
                     <a:stretch>
                       <a:fillRect/>
                     </a:stretch>
@@ -10657,7 +12261,7 @@
         <w:widowControl/>
         <w:numPr>
           <w:ilvl w:val="1"/>
-          <w:numId w:val="14"/>
+          <w:numId w:val="15"/>
         </w:numPr>
         <w:suppressLineNumbers w:val="0"/>
         <w:spacing w:before="0" w:beforeAutospacing="0" w:after="0" w:afterAutospacing="0" w:line="360" w:lineRule="auto"/>
@@ -10766,7 +12370,7 @@
         <w:widowControl/>
         <w:numPr>
           <w:ilvl w:val="2"/>
-          <w:numId w:val="14"/>
+          <w:numId w:val="15"/>
         </w:numPr>
         <w:suppressLineNumbers w:val="0"/>
         <w:spacing w:before="0" w:beforeAutospacing="0" w:after="0" w:afterAutospacing="0" w:line="360" w:lineRule="auto"/>
@@ -10805,7 +12409,7 @@
                     </pic:cNvPicPr>
                   </pic:nvPicPr>
                   <pic:blipFill>
-                    <a:blip r:embed="rId43"/>
+                    <a:blip r:embed="rId42"/>
                     <a:stretch>
                       <a:fillRect/>
                     </a:stretch>
@@ -10837,7 +12441,7 @@
         <w:widowControl/>
         <w:numPr>
           <w:ilvl w:val="1"/>
-          <w:numId w:val="14"/>
+          <w:numId w:val="15"/>
         </w:numPr>
         <w:suppressLineNumbers w:val="0"/>
         <w:spacing w:before="0" w:beforeAutospacing="0" w:after="0" w:afterAutospacing="0" w:line="360" w:lineRule="auto"/>
@@ -11044,7 +12648,7 @@
         <w:widowControl/>
         <w:numPr>
           <w:ilvl w:val="2"/>
-          <w:numId w:val="14"/>
+          <w:numId w:val="15"/>
         </w:numPr>
         <w:suppressLineNumbers w:val="0"/>
         <w:spacing w:before="0" w:beforeAutospacing="0" w:after="0" w:afterAutospacing="0" w:line="360" w:lineRule="auto"/>
@@ -11083,7 +12687,7 @@
                     </pic:cNvPicPr>
                   </pic:nvPicPr>
                   <pic:blipFill>
-                    <a:blip r:embed="rId44"/>
+                    <a:blip r:embed="rId43"/>
                     <a:stretch>
                       <a:fillRect/>
                     </a:stretch>
@@ -11115,7 +12719,7 @@
         <w:widowControl/>
         <w:numPr>
           <w:ilvl w:val="1"/>
-          <w:numId w:val="14"/>
+          <w:numId w:val="15"/>
         </w:numPr>
         <w:suppressLineNumbers w:val="0"/>
         <w:spacing w:before="0" w:beforeAutospacing="0" w:after="0" w:afterAutospacing="0" w:line="360" w:lineRule="auto"/>
@@ -11154,7 +12758,7 @@
                     </pic:cNvPicPr>
                   </pic:nvPicPr>
                   <pic:blipFill>
-                    <a:blip r:embed="rId45"/>
+                    <a:blip r:embed="rId44"/>
                     <a:stretch>
                       <a:fillRect/>
                     </a:stretch>
@@ -11186,7 +12790,7 @@
         <w:widowControl/>
         <w:numPr>
           <w:ilvl w:val="2"/>
-          <w:numId w:val="14"/>
+          <w:numId w:val="15"/>
         </w:numPr>
         <w:suppressLineNumbers w:val="0"/>
         <w:spacing w:before="0" w:beforeAutospacing="0" w:after="0" w:afterAutospacing="0" w:line="360" w:lineRule="auto"/>
@@ -11261,7 +12865,7 @@
         <w:widowControl/>
         <w:numPr>
           <w:ilvl w:val="2"/>
-          <w:numId w:val="14"/>
+          <w:numId w:val="15"/>
         </w:numPr>
         <w:suppressLineNumbers w:val="0"/>
         <w:spacing w:before="0" w:beforeAutospacing="0" w:after="0" w:afterAutospacing="0" w:line="360" w:lineRule="auto"/>
@@ -11356,7 +12960,7 @@
         <w:widowControl/>
         <w:numPr>
           <w:ilvl w:val="2"/>
-          <w:numId w:val="14"/>
+          <w:numId w:val="15"/>
         </w:numPr>
         <w:suppressLineNumbers w:val="0"/>
         <w:spacing w:before="0" w:beforeAutospacing="0" w:after="0" w:afterAutospacing="0" w:line="360" w:lineRule="auto"/>
@@ -11489,7 +13093,7 @@
         <w:widowControl/>
         <w:numPr>
           <w:ilvl w:val="1"/>
-          <w:numId w:val="14"/>
+          <w:numId w:val="15"/>
         </w:numPr>
         <w:suppressLineNumbers w:val="0"/>
         <w:spacing w:before="0" w:beforeAutospacing="0" w:after="0" w:afterAutospacing="0" w:line="360" w:lineRule="auto"/>
@@ -12184,7 +13788,7 @@
                     </pic:cNvPicPr>
                   </pic:nvPicPr>
                   <pic:blipFill>
-                    <a:blip r:embed="rId46"/>
+                    <a:blip r:embed="rId45"/>
                     <a:stretch>
                       <a:fillRect/>
                     </a:stretch>
@@ -12245,7 +13849,7 @@
                     </pic:cNvPicPr>
                   </pic:nvPicPr>
                   <pic:blipFill>
-                    <a:blip r:embed="rId47"/>
+                    <a:blip r:embed="rId46"/>
                     <a:stretch>
                       <a:fillRect/>
                     </a:stretch>
@@ -12331,7 +13935,7 @@
                     </pic:cNvPicPr>
                   </pic:nvPicPr>
                   <pic:blipFill>
-                    <a:blip r:embed="rId48"/>
+                    <a:blip r:embed="rId47"/>
                     <a:stretch>
                       <a:fillRect/>
                     </a:stretch>
@@ -12707,7 +14311,7 @@
                     </pic:cNvPicPr>
                   </pic:nvPicPr>
                   <pic:blipFill>
-                    <a:blip r:embed="rId49"/>
+                    <a:blip r:embed="rId48"/>
                     <a:stretch>
                       <a:fillRect/>
                     </a:stretch>
@@ -12872,7 +14476,7 @@
                     </pic:cNvPicPr>
                   </pic:nvPicPr>
                   <pic:blipFill>
-                    <a:blip r:embed="rId50"/>
+                    <a:blip r:embed="rId49"/>
                     <a:stretch>
                       <a:fillRect/>
                     </a:stretch>
@@ -13297,7 +14901,7 @@
                     </pic:cNvPicPr>
                   </pic:nvPicPr>
                   <pic:blipFill>
-                    <a:blip r:embed="rId51"/>
+                    <a:blip r:embed="rId50"/>
                     <a:stretch>
                       <a:fillRect/>
                     </a:stretch>
@@ -13423,7 +15027,7 @@
                     </pic:cNvPicPr>
                   </pic:nvPicPr>
                   <pic:blipFill>
-                    <a:blip r:embed="rId52"/>
+                    <a:blip r:embed="rId51"/>
                     <a:stretch>
                       <a:fillRect/>
                     </a:stretch>
@@ -13698,7 +15302,7 @@
                     </pic:cNvPicPr>
                   </pic:nvPicPr>
                   <pic:blipFill>
-                    <a:blip r:embed="rId53"/>
+                    <a:blip r:embed="rId52"/>
                     <a:stretch>
                       <a:fillRect/>
                     </a:stretch>
@@ -13883,7 +15487,7 @@
                     </pic:cNvPicPr>
                   </pic:nvPicPr>
                   <pic:blipFill>
-                    <a:blip r:embed="rId54"/>
+                    <a:blip r:embed="rId53"/>
                     <a:stretch>
                       <a:fillRect/>
                     </a:stretch>
@@ -14360,7 +15964,7 @@
                     </pic:cNvPicPr>
                   </pic:nvPicPr>
                   <pic:blipFill>
-                    <a:blip r:embed="rId55"/>
+                    <a:blip r:embed="rId54"/>
                     <a:stretch>
                       <a:fillRect/>
                     </a:stretch>
@@ -14482,7 +16086,7 @@
                     </pic:cNvPicPr>
                   </pic:nvPicPr>
                   <pic:blipFill>
-                    <a:blip r:embed="rId56"/>
+                    <a:blip r:embed="rId55"/>
                     <a:stretch>
                       <a:fillRect/>
                     </a:stretch>
@@ -14742,7 +16346,7 @@
                     </pic:cNvPicPr>
                   </pic:nvPicPr>
                   <pic:blipFill>
-                    <a:blip r:embed="rId57"/>
+                    <a:blip r:embed="rId56"/>
                     <a:stretch>
                       <a:fillRect/>
                     </a:stretch>
@@ -15038,7 +16642,7 @@
                     </pic:cNvPicPr>
                   </pic:nvPicPr>
                   <pic:blipFill>
-                    <a:blip r:embed="rId58"/>
+                    <a:blip r:embed="rId57"/>
                     <a:stretch>
                       <a:fillRect/>
                     </a:stretch>
@@ -15142,7 +16746,7 @@
                     </pic:cNvPicPr>
                   </pic:nvPicPr>
                   <pic:blipFill>
-                    <a:blip r:embed="rId59"/>
+                    <a:blip r:embed="rId58"/>
                     <a:stretch>
                       <a:fillRect/>
                     </a:stretch>
@@ -15831,8 +17435,6 @@
         </w:rPr>
         <w:t>F</w:t>
       </w:r>
-      <w:bookmarkStart w:id="0" w:name="_GoBack"/>
-      <w:bookmarkEnd w:id="0"/>
     </w:p>
     <w:sectPr>
       <w:pgSz w:w="11906" w:h="16838"/>
@@ -15847,6 +17449,146 @@
 <file path=word/numbering.xml><?xml version="1.0" encoding="utf-8"?>
 <w:numbering xmlns:wpc="http://schemas.microsoft.com/office/word/2010/wordprocessingCanvas" xmlns:mc="http://schemas.openxmlformats.org/markup-compatibility/2006" xmlns:o="urn:schemas-microsoft-com:office:office" xmlns:r="http://schemas.openxmlformats.org/officeDocument/2006/relationships" xmlns:m="http://schemas.openxmlformats.org/officeDocument/2006/math" xmlns:v="urn:schemas-microsoft-com:vml" xmlns:wp14="http://schemas.microsoft.com/office/word/2010/wordprocessingDrawing" xmlns:wp="http://schemas.openxmlformats.org/drawingml/2006/wordprocessingDrawing" xmlns:w10="urn:schemas-microsoft-com:office:word" xmlns:w="http://schemas.openxmlformats.org/wordprocessingml/2006/main" xmlns:w14="http://schemas.microsoft.com/office/word/2010/wordml" xmlns:wpg="http://schemas.microsoft.com/office/word/2010/wordprocessingGroup" xmlns:wpi="http://schemas.microsoft.com/office/word/2010/wordprocessingInk" xmlns:wne="http://schemas.microsoft.com/office/word/2006/wordml" xmlns:wps="http://schemas.microsoft.com/office/word/2010/wordprocessingShape" xmlns:wpsCustomData="http://www.wps.cn/officeDocument/2013/wpsCustomData" mc:Ignorable="w14 wp14">
   <w:abstractNum w:abstractNumId="0">
+    <w:nsid w:val="81915725"/>
+    <w:multiLevelType w:val="multilevel"/>
+    <w:tmpl w:val="81915725"/>
+    <w:lvl w:ilvl="0" w:tentative="0">
+      <w:start w:val="1"/>
+      <w:numFmt w:val="bullet"/>
+      <w:lvlText w:val=""/>
+      <w:lvlJc w:val="left"/>
+      <w:pPr>
+        <w:tabs>
+          <w:tab w:val="left" w:pos="420"/>
+        </w:tabs>
+        <w:ind w:left="420" w:hanging="420"/>
+      </w:pPr>
+      <w:rPr>
+        <w:rFonts w:hint="default" w:ascii="Wingdings" w:hAnsi="Wingdings" w:cs="Wingdings"/>
+      </w:rPr>
+    </w:lvl>
+    <w:lvl w:ilvl="1" w:tentative="0">
+      <w:start w:val="1"/>
+      <w:numFmt w:val="bullet"/>
+      <w:lvlText w:val="ﻤ"/>
+      <w:lvlJc w:val="left"/>
+      <w:pPr>
+        <w:tabs>
+          <w:tab w:val="left" w:pos="840"/>
+        </w:tabs>
+        <w:ind w:left="840" w:hanging="420"/>
+      </w:pPr>
+      <w:rPr>
+        <w:rFonts w:hint="default" w:ascii="Arial" w:hAnsi="Arial" w:cs="Arial"/>
+      </w:rPr>
+    </w:lvl>
+    <w:lvl w:ilvl="2" w:tentative="0">
+      <w:start w:val="1"/>
+      <w:numFmt w:val="bullet"/>
+      <w:lvlText w:val="ﺀ"/>
+      <w:lvlJc w:val="left"/>
+      <w:pPr>
+        <w:tabs>
+          <w:tab w:val="left" w:pos="1260"/>
+        </w:tabs>
+        <w:ind w:left="1260" w:hanging="420"/>
+      </w:pPr>
+      <w:rPr>
+        <w:rFonts w:hint="default" w:ascii="Arial" w:hAnsi="Arial" w:cs="Arial"/>
+      </w:rPr>
+    </w:lvl>
+    <w:lvl w:ilvl="3" w:tentative="0">
+      <w:start w:val="1"/>
+      <w:numFmt w:val="bullet"/>
+      <w:lvlText w:val="﮺"/>
+      <w:lvlJc w:val="left"/>
+      <w:pPr>
+        <w:tabs>
+          <w:tab w:val="left" w:pos="1680"/>
+        </w:tabs>
+        <w:ind w:left="1680" w:hanging="420"/>
+      </w:pPr>
+      <w:rPr>
+        <w:rFonts w:hint="default" w:ascii="Arial" w:hAnsi="Arial" w:cs="Arial"/>
+      </w:rPr>
+    </w:lvl>
+    <w:lvl w:ilvl="4" w:tentative="0">
+      <w:start w:val="1"/>
+      <w:numFmt w:val="bullet"/>
+      <w:lvlText w:val="꜠"/>
+      <w:lvlJc w:val="left"/>
+      <w:pPr>
+        <w:tabs>
+          <w:tab w:val="left" w:pos="2100"/>
+        </w:tabs>
+        <w:ind w:left="2100" w:hanging="420"/>
+      </w:pPr>
+      <w:rPr>
+        <w:rFonts w:hint="default" w:ascii="Arial" w:hAnsi="Arial" w:cs="Arial"/>
+      </w:rPr>
+    </w:lvl>
+    <w:lvl w:ilvl="5" w:tentative="0">
+      <w:start w:val="1"/>
+      <w:numFmt w:val="bullet"/>
+      <w:lvlText w:val="﯀"/>
+      <w:lvlJc w:val="left"/>
+      <w:pPr>
+        <w:tabs>
+          <w:tab w:val="left" w:pos="2520"/>
+        </w:tabs>
+        <w:ind w:left="2520" w:hanging="420"/>
+      </w:pPr>
+      <w:rPr>
+        <w:rFonts w:hint="default" w:ascii="Arial" w:hAnsi="Arial" w:cs="Arial"/>
+      </w:rPr>
+    </w:lvl>
+    <w:lvl w:ilvl="6" w:tentative="0">
+      <w:start w:val="1"/>
+      <w:numFmt w:val="bullet"/>
+      <w:lvlText w:val="͋"/>
+      <w:lvlJc w:val="left"/>
+      <w:pPr>
+        <w:tabs>
+          <w:tab w:val="left" w:pos="2940"/>
+        </w:tabs>
+        <w:ind w:left="2940" w:hanging="420"/>
+      </w:pPr>
+      <w:rPr>
+        <w:rFonts w:hint="default" w:ascii="Arial" w:hAnsi="Arial" w:cs="Arial"/>
+      </w:rPr>
+    </w:lvl>
+    <w:lvl w:ilvl="7" w:tentative="0">
+      <w:start w:val="1"/>
+      <w:numFmt w:val="bullet"/>
+      <w:lvlText w:val=""/>
+      <w:lvlJc w:val="left"/>
+      <w:pPr>
+        <w:tabs>
+          <w:tab w:val="left" w:pos="3360"/>
+        </w:tabs>
+        <w:ind w:left="3360" w:hanging="420"/>
+      </w:pPr>
+      <w:rPr>
+        <w:rFonts w:hint="default" w:ascii="Wingdings" w:hAnsi="Wingdings" w:cs="Wingdings"/>
+      </w:rPr>
+    </w:lvl>
+    <w:lvl w:ilvl="8" w:tentative="0">
+      <w:start w:val="1"/>
+      <w:numFmt w:val="bullet"/>
+      <w:lvlText w:val=""/>
+      <w:lvlJc w:val="left"/>
+      <w:pPr>
+        <w:tabs>
+          <w:tab w:val="left" w:pos="3780"/>
+        </w:tabs>
+        <w:ind w:left="3780" w:hanging="420"/>
+      </w:pPr>
+      <w:rPr>
+        <w:rFonts w:hint="default" w:ascii="Wingdings" w:hAnsi="Wingdings" w:cs="Wingdings"/>
+      </w:rPr>
+    </w:lvl>
+  </w:abstractNum>
+  <w:abstractNum w:abstractNumId="1">
     <w:nsid w:val="B91C4161"/>
     <w:multiLevelType w:val="multilevel"/>
     <w:tmpl w:val="B91C4161"/>
@@ -15986,7 +17728,7 @@
       </w:rPr>
     </w:lvl>
   </w:abstractNum>
-  <w:abstractNum w:abstractNumId="1">
+  <w:abstractNum w:abstractNumId="2">
     <w:nsid w:val="FFFFFF7C"/>
     <w:multiLevelType w:val="singleLevel"/>
     <w:tmpl w:val="FFFFFF7C"/>
@@ -16004,7 +17746,7 @@
       </w:pPr>
     </w:lvl>
   </w:abstractNum>
-  <w:abstractNum w:abstractNumId="2">
+  <w:abstractNum w:abstractNumId="3">
     <w:nsid w:val="FFFFFF7D"/>
     <w:multiLevelType w:val="singleLevel"/>
     <w:tmpl w:val="FFFFFF7D"/>
@@ -16022,7 +17764,7 @@
       </w:pPr>
     </w:lvl>
   </w:abstractNum>
-  <w:abstractNum w:abstractNumId="3">
+  <w:abstractNum w:abstractNumId="4">
     <w:nsid w:val="FFFFFF7E"/>
     <w:multiLevelType w:val="singleLevel"/>
     <w:tmpl w:val="FFFFFF7E"/>
@@ -16040,7 +17782,7 @@
       </w:pPr>
     </w:lvl>
   </w:abstractNum>
-  <w:abstractNum w:abstractNumId="4">
+  <w:abstractNum w:abstractNumId="5">
     <w:nsid w:val="FFFFFF7F"/>
     <w:multiLevelType w:val="singleLevel"/>
     <w:tmpl w:val="FFFFFF7F"/>
@@ -16058,7 +17800,7 @@
       </w:pPr>
     </w:lvl>
   </w:abstractNum>
-  <w:abstractNum w:abstractNumId="5">
+  <w:abstractNum w:abstractNumId="6">
     <w:nsid w:val="FFFFFF80"/>
     <w:multiLevelType w:val="singleLevel"/>
     <w:tmpl w:val="FFFFFF80"/>
@@ -16079,7 +17821,7 @@
       </w:rPr>
     </w:lvl>
   </w:abstractNum>
-  <w:abstractNum w:abstractNumId="6">
+  <w:abstractNum w:abstractNumId="7">
     <w:nsid w:val="FFFFFF81"/>
     <w:multiLevelType w:val="singleLevel"/>
     <w:tmpl w:val="FFFFFF81"/>
@@ -16100,7 +17842,7 @@
       </w:rPr>
     </w:lvl>
   </w:abstractNum>
-  <w:abstractNum w:abstractNumId="7">
+  <w:abstractNum w:abstractNumId="8">
     <w:nsid w:val="FFFFFF82"/>
     <w:multiLevelType w:val="singleLevel"/>
     <w:tmpl w:val="FFFFFF82"/>
@@ -16121,7 +17863,7 @@
       </w:rPr>
     </w:lvl>
   </w:abstractNum>
-  <w:abstractNum w:abstractNumId="8">
+  <w:abstractNum w:abstractNumId="9">
     <w:nsid w:val="FFFFFF83"/>
     <w:multiLevelType w:val="singleLevel"/>
     <w:tmpl w:val="FFFFFF83"/>
@@ -16142,7 +17884,7 @@
       </w:rPr>
     </w:lvl>
   </w:abstractNum>
-  <w:abstractNum w:abstractNumId="9">
+  <w:abstractNum w:abstractNumId="10">
     <w:nsid w:val="FFFFFF88"/>
     <w:multiLevelType w:val="singleLevel"/>
     <w:tmpl w:val="FFFFFF88"/>
@@ -16160,7 +17902,7 @@
       </w:pPr>
     </w:lvl>
   </w:abstractNum>
-  <w:abstractNum w:abstractNumId="10">
+  <w:abstractNum w:abstractNumId="11">
     <w:nsid w:val="FFFFFF89"/>
     <w:multiLevelType w:val="singleLevel"/>
     <w:tmpl w:val="FFFFFF89"/>
@@ -16181,7 +17923,7 @@
       </w:rPr>
     </w:lvl>
   </w:abstractNum>
-  <w:abstractNum w:abstractNumId="11">
+  <w:abstractNum w:abstractNumId="12">
     <w:nsid w:val="44B7DF9D"/>
     <w:multiLevelType w:val="multilevel"/>
     <w:tmpl w:val="44B7DF9D"/>
@@ -16321,7 +18063,147 @@
       </w:rPr>
     </w:lvl>
   </w:abstractNum>
-  <w:abstractNum w:abstractNumId="12">
+  <w:abstractNum w:abstractNumId="13">
+    <w:nsid w:val="4C82EAC0"/>
+    <w:multiLevelType w:val="multilevel"/>
+    <w:tmpl w:val="4C82EAC0"/>
+    <w:lvl w:ilvl="0" w:tentative="0">
+      <w:start w:val="1"/>
+      <w:numFmt w:val="bullet"/>
+      <w:lvlText w:val=""/>
+      <w:lvlJc w:val="left"/>
+      <w:pPr>
+        <w:tabs>
+          <w:tab w:val="left" w:pos="420"/>
+        </w:tabs>
+        <w:ind w:left="420" w:hanging="420"/>
+      </w:pPr>
+      <w:rPr>
+        <w:rFonts w:hint="default" w:ascii="Wingdings" w:hAnsi="Wingdings" w:cs="Wingdings"/>
+      </w:rPr>
+    </w:lvl>
+    <w:lvl w:ilvl="1" w:tentative="0">
+      <w:start w:val="1"/>
+      <w:numFmt w:val="bullet"/>
+      <w:lvlText w:val="ﻤ"/>
+      <w:lvlJc w:val="left"/>
+      <w:pPr>
+        <w:tabs>
+          <w:tab w:val="left" w:pos="840"/>
+        </w:tabs>
+        <w:ind w:left="840" w:hanging="420"/>
+      </w:pPr>
+      <w:rPr>
+        <w:rFonts w:hint="default" w:ascii="Arial" w:hAnsi="Arial" w:cs="Arial"/>
+      </w:rPr>
+    </w:lvl>
+    <w:lvl w:ilvl="2" w:tentative="0">
+      <w:start w:val="1"/>
+      <w:numFmt w:val="bullet"/>
+      <w:lvlText w:val="ﺀ"/>
+      <w:lvlJc w:val="left"/>
+      <w:pPr>
+        <w:tabs>
+          <w:tab w:val="left" w:pos="1260"/>
+        </w:tabs>
+        <w:ind w:left="1260" w:hanging="420"/>
+      </w:pPr>
+      <w:rPr>
+        <w:rFonts w:hint="default" w:ascii="Arial" w:hAnsi="Arial" w:cs="Arial"/>
+      </w:rPr>
+    </w:lvl>
+    <w:lvl w:ilvl="3" w:tentative="0">
+      <w:start w:val="1"/>
+      <w:numFmt w:val="bullet"/>
+      <w:lvlText w:val="﮺"/>
+      <w:lvlJc w:val="left"/>
+      <w:pPr>
+        <w:tabs>
+          <w:tab w:val="left" w:pos="1680"/>
+        </w:tabs>
+        <w:ind w:left="1680" w:hanging="420"/>
+      </w:pPr>
+      <w:rPr>
+        <w:rFonts w:hint="default" w:ascii="Arial" w:hAnsi="Arial" w:cs="Arial"/>
+      </w:rPr>
+    </w:lvl>
+    <w:lvl w:ilvl="4" w:tentative="0">
+      <w:start w:val="1"/>
+      <w:numFmt w:val="bullet"/>
+      <w:lvlText w:val="꜠"/>
+      <w:lvlJc w:val="left"/>
+      <w:pPr>
+        <w:tabs>
+          <w:tab w:val="left" w:pos="2100"/>
+        </w:tabs>
+        <w:ind w:left="2100" w:hanging="420"/>
+      </w:pPr>
+      <w:rPr>
+        <w:rFonts w:hint="default" w:ascii="Arial" w:hAnsi="Arial" w:cs="Arial"/>
+      </w:rPr>
+    </w:lvl>
+    <w:lvl w:ilvl="5" w:tentative="0">
+      <w:start w:val="1"/>
+      <w:numFmt w:val="bullet"/>
+      <w:lvlText w:val="﯀"/>
+      <w:lvlJc w:val="left"/>
+      <w:pPr>
+        <w:tabs>
+          <w:tab w:val="left" w:pos="2520"/>
+        </w:tabs>
+        <w:ind w:left="2520" w:hanging="420"/>
+      </w:pPr>
+      <w:rPr>
+        <w:rFonts w:hint="default" w:ascii="Arial" w:hAnsi="Arial" w:cs="Arial"/>
+      </w:rPr>
+    </w:lvl>
+    <w:lvl w:ilvl="6" w:tentative="0">
+      <w:start w:val="1"/>
+      <w:numFmt w:val="bullet"/>
+      <w:lvlText w:val="͋"/>
+      <w:lvlJc w:val="left"/>
+      <w:pPr>
+        <w:tabs>
+          <w:tab w:val="left" w:pos="2940"/>
+        </w:tabs>
+        <w:ind w:left="2940" w:hanging="420"/>
+      </w:pPr>
+      <w:rPr>
+        <w:rFonts w:hint="default" w:ascii="Arial" w:hAnsi="Arial" w:cs="Arial"/>
+      </w:rPr>
+    </w:lvl>
+    <w:lvl w:ilvl="7" w:tentative="0">
+      <w:start w:val="1"/>
+      <w:numFmt w:val="bullet"/>
+      <w:lvlText w:val=""/>
+      <w:lvlJc w:val="left"/>
+      <w:pPr>
+        <w:tabs>
+          <w:tab w:val="left" w:pos="3360"/>
+        </w:tabs>
+        <w:ind w:left="3360" w:hanging="420"/>
+      </w:pPr>
+      <w:rPr>
+        <w:rFonts w:hint="default" w:ascii="Wingdings" w:hAnsi="Wingdings" w:cs="Wingdings"/>
+      </w:rPr>
+    </w:lvl>
+    <w:lvl w:ilvl="8" w:tentative="0">
+      <w:start w:val="1"/>
+      <w:numFmt w:val="bullet"/>
+      <w:lvlText w:val=""/>
+      <w:lvlJc w:val="left"/>
+      <w:pPr>
+        <w:tabs>
+          <w:tab w:val="left" w:pos="3780"/>
+        </w:tabs>
+        <w:ind w:left="3780" w:hanging="420"/>
+      </w:pPr>
+      <w:rPr>
+        <w:rFonts w:hint="default" w:ascii="Wingdings" w:hAnsi="Wingdings" w:cs="Wingdings"/>
+      </w:rPr>
+    </w:lvl>
+  </w:abstractNum>
+  <w:abstractNum w:abstractNumId="14">
     <w:nsid w:val="4D66F3C4"/>
     <w:multiLevelType w:val="multilevel"/>
     <w:tmpl w:val="4D66F3C4"/>
@@ -16461,187 +18343,50 @@
       </w:rPr>
     </w:lvl>
   </w:abstractNum>
-  <w:abstractNum w:abstractNumId="13">
-    <w:nsid w:val="69EB294D"/>
-    <w:multiLevelType w:val="multilevel"/>
-    <w:tmpl w:val="69EB294D"/>
-    <w:lvl w:ilvl="0" w:tentative="0">
-      <w:start w:val="1"/>
-      <w:numFmt w:val="bullet"/>
-      <w:lvlText w:val=""/>
-      <w:lvlJc w:val="left"/>
-      <w:pPr>
-        <w:tabs>
-          <w:tab w:val="left" w:pos="420"/>
-        </w:tabs>
-        <w:ind w:left="420" w:hanging="420"/>
-      </w:pPr>
-      <w:rPr>
-        <w:rFonts w:hint="default" w:ascii="Wingdings" w:hAnsi="Wingdings" w:cs="Wingdings"/>
-      </w:rPr>
-    </w:lvl>
-    <w:lvl w:ilvl="1" w:tentative="0">
-      <w:start w:val="1"/>
-      <w:numFmt w:val="bullet"/>
-      <w:lvlText w:val="ﻤ"/>
-      <w:lvlJc w:val="left"/>
-      <w:pPr>
-        <w:tabs>
-          <w:tab w:val="left" w:pos="840"/>
-        </w:tabs>
-        <w:ind w:left="840" w:hanging="420"/>
-      </w:pPr>
-      <w:rPr>
-        <w:rFonts w:hint="default" w:ascii="Arial" w:hAnsi="Arial" w:cs="Arial"/>
-      </w:rPr>
-    </w:lvl>
-    <w:lvl w:ilvl="2" w:tentative="0">
-      <w:start w:val="1"/>
-      <w:numFmt w:val="bullet"/>
-      <w:lvlText w:val="ﺀ"/>
-      <w:lvlJc w:val="left"/>
-      <w:pPr>
-        <w:tabs>
-          <w:tab w:val="left" w:pos="1260"/>
-        </w:tabs>
-        <w:ind w:left="1260" w:hanging="420"/>
-      </w:pPr>
-      <w:rPr>
-        <w:rFonts w:hint="default" w:ascii="Arial" w:hAnsi="Arial" w:cs="Arial"/>
-      </w:rPr>
-    </w:lvl>
-    <w:lvl w:ilvl="3" w:tentative="0">
-      <w:start w:val="1"/>
-      <w:numFmt w:val="bullet"/>
-      <w:lvlText w:val="﮺"/>
-      <w:lvlJc w:val="left"/>
-      <w:pPr>
-        <w:tabs>
-          <w:tab w:val="left" w:pos="1680"/>
-        </w:tabs>
-        <w:ind w:left="1680" w:hanging="420"/>
-      </w:pPr>
-      <w:rPr>
-        <w:rFonts w:hint="default" w:ascii="Arial" w:hAnsi="Arial" w:cs="Arial"/>
-      </w:rPr>
-    </w:lvl>
-    <w:lvl w:ilvl="4" w:tentative="0">
-      <w:start w:val="1"/>
-      <w:numFmt w:val="bullet"/>
-      <w:lvlText w:val="꜠"/>
-      <w:lvlJc w:val="left"/>
-      <w:pPr>
-        <w:tabs>
-          <w:tab w:val="left" w:pos="2100"/>
-        </w:tabs>
-        <w:ind w:left="2100" w:hanging="420"/>
-      </w:pPr>
-      <w:rPr>
-        <w:rFonts w:hint="default" w:ascii="Arial" w:hAnsi="Arial" w:cs="Arial"/>
-      </w:rPr>
-    </w:lvl>
-    <w:lvl w:ilvl="5" w:tentative="0">
-      <w:start w:val="1"/>
-      <w:numFmt w:val="bullet"/>
-      <w:lvlText w:val="﯀"/>
-      <w:lvlJc w:val="left"/>
-      <w:pPr>
-        <w:tabs>
-          <w:tab w:val="left" w:pos="2520"/>
-        </w:tabs>
-        <w:ind w:left="2520" w:hanging="420"/>
-      </w:pPr>
-      <w:rPr>
-        <w:rFonts w:hint="default" w:ascii="Arial" w:hAnsi="Arial" w:cs="Arial"/>
-      </w:rPr>
-    </w:lvl>
-    <w:lvl w:ilvl="6" w:tentative="0">
-      <w:start w:val="1"/>
-      <w:numFmt w:val="bullet"/>
-      <w:lvlText w:val="͋"/>
-      <w:lvlJc w:val="left"/>
-      <w:pPr>
-        <w:tabs>
-          <w:tab w:val="left" w:pos="2940"/>
-        </w:tabs>
-        <w:ind w:left="2940" w:hanging="420"/>
-      </w:pPr>
-      <w:rPr>
-        <w:rFonts w:hint="default" w:ascii="Arial" w:hAnsi="Arial" w:cs="Arial"/>
-      </w:rPr>
-    </w:lvl>
-    <w:lvl w:ilvl="7" w:tentative="0">
-      <w:start w:val="1"/>
-      <w:numFmt w:val="bullet"/>
-      <w:lvlText w:val=""/>
-      <w:lvlJc w:val="left"/>
-      <w:pPr>
-        <w:tabs>
-          <w:tab w:val="left" w:pos="3360"/>
-        </w:tabs>
-        <w:ind w:left="3360" w:hanging="420"/>
-      </w:pPr>
-      <w:rPr>
-        <w:rFonts w:hint="default" w:ascii="Wingdings" w:hAnsi="Wingdings" w:cs="Wingdings"/>
-      </w:rPr>
-    </w:lvl>
-    <w:lvl w:ilvl="8" w:tentative="0">
-      <w:start w:val="1"/>
-      <w:numFmt w:val="bullet"/>
-      <w:lvlText w:val=""/>
-      <w:lvlJc w:val="left"/>
-      <w:pPr>
-        <w:tabs>
-          <w:tab w:val="left" w:pos="3780"/>
-        </w:tabs>
-        <w:ind w:left="3780" w:hanging="420"/>
-      </w:pPr>
-      <w:rPr>
-        <w:rFonts w:hint="default" w:ascii="Wingdings" w:hAnsi="Wingdings" w:cs="Wingdings"/>
-      </w:rPr>
-    </w:lvl>
-  </w:abstractNum>
   <w:num w:numId="1">
+    <w:abstractNumId w:val="11"/>
+  </w:num>
+  <w:num w:numId="2">
+    <w:abstractNumId w:val="9"/>
+  </w:num>
+  <w:num w:numId="3">
+    <w:abstractNumId w:val="8"/>
+  </w:num>
+  <w:num w:numId="4">
+    <w:abstractNumId w:val="7"/>
+  </w:num>
+  <w:num w:numId="5">
+    <w:abstractNumId w:val="6"/>
+  </w:num>
+  <w:num w:numId="6">
     <w:abstractNumId w:val="10"/>
   </w:num>
-  <w:num w:numId="2">
-    <w:abstractNumId w:val="8"/>
-  </w:num>
-  <w:num w:numId="3">
-    <w:abstractNumId w:val="7"/>
-  </w:num>
-  <w:num w:numId="4">
-    <w:abstractNumId w:val="6"/>
-  </w:num>
-  <w:num w:numId="5">
+  <w:num w:numId="7">
     <w:abstractNumId w:val="5"/>
   </w:num>
-  <w:num w:numId="6">
-    <w:abstractNumId w:val="9"/>
-  </w:num>
-  <w:num w:numId="7">
+  <w:num w:numId="8">
     <w:abstractNumId w:val="4"/>
   </w:num>
-  <w:num w:numId="8">
+  <w:num w:numId="9">
     <w:abstractNumId w:val="3"/>
   </w:num>
-  <w:num w:numId="9">
+  <w:num w:numId="10">
     <w:abstractNumId w:val="2"/>
   </w:num>
-  <w:num w:numId="10">
+  <w:num w:numId="11">
+    <w:abstractNumId w:val="12"/>
+  </w:num>
+  <w:num w:numId="12">
     <w:abstractNumId w:val="1"/>
   </w:num>
-  <w:num w:numId="11">
-    <w:abstractNumId w:val="11"/>
-  </w:num>
-  <w:num w:numId="12">
+  <w:num w:numId="13">
     <w:abstractNumId w:val="0"/>
   </w:num>
-  <w:num w:numId="13">
+  <w:num w:numId="14">
     <w:abstractNumId w:val="13"/>
   </w:num>
-  <w:num w:numId="14">
-    <w:abstractNumId w:val="12"/>
+  <w:num w:numId="15">
+    <w:abstractNumId w:val="14"/>
   </w:num>
 </w:numbering>
 </file>
@@ -16874,7 +18619,7 @@
     <w:lsdException w:qFormat="1" w:unhideWhenUsed="0" w:uiPriority="68" w:semiHidden="0" w:name="Medium Grid 2 Accent 4"/>
     <w:lsdException w:qFormat="1" w:unhideWhenUsed="0" w:uiPriority="69" w:semiHidden="0" w:name="Medium Grid 3 Accent 4"/>
     <w:lsdException w:unhideWhenUsed="0" w:uiPriority="70" w:semiHidden="0" w:name="Dark List Accent 4"/>
-    <w:lsdException w:unhideWhenUsed="0" w:uiPriority="71" w:semiHidden="0" w:name="Colorful Shading Accent 4"/>
+    <w:lsdException w:qFormat="1" w:unhideWhenUsed="0" w:uiPriority="71" w:semiHidden="0" w:name="Colorful Shading Accent 4"/>
     <w:lsdException w:qFormat="1" w:unhideWhenUsed="0" w:uiPriority="72" w:semiHidden="0" w:name="Colorful List Accent 4"/>
     <w:lsdException w:unhideWhenUsed="0" w:uiPriority="73" w:semiHidden="0" w:name="Colorful Grid Accent 4"/>
     <w:lsdException w:qFormat="1" w:unhideWhenUsed="0" w:uiPriority="60" w:semiHidden="0" w:name="Light Shading Accent 5"/>
@@ -29472,6 +31217,7 @@
   <w:style w:type="table" w:styleId="232">
     <w:name w:val="Colorful Shading Accent 4"/>
     <w:basedOn w:val="12"/>
+    <w:qFormat/>
     <w:uiPriority w:val="71"/>
     <w:rPr>
       <w:color w:val="000000"/>

</xml_diff>